<commit_message>
Review 61 (final): 20 papers on stakeholder decisions under intense rainfall, drought and causal change; ROJA-GO on 20 aquifers
- sx.json: 20 aquifers, five storylines, closed-loop curtailment rule.
  With "cut pumping after an alarm", ROJA-GO keeps exceedance at 4.7% (record
  drought), 9.1% (causal change) and 4.3% (compound), against 5.9/11.5/5.1%
  with the yearly sample and 15.0/21.2/13.1% with the static alarm.
- Open-loop validity: ROJA-GO under-warns in 2.7-4.3% of stress seasons
  (yearly sample 3.5-8.3%); aquifers above target under the causal change 6 -> 2.
- Figure R1 and the short Word review rebuilt from the full run.

Co-Authored-By: Claude Opus 5.5 <noreply@anthropic.com>
Claude-Session: https://claude.ai/code/session_016Cdcj2FTAQGBVsJUyYJR2M
</commit_message>
<xml_diff>
--- a/docs/literature/Literature_review_Stakeholder_Decisions_IV_Intense_Rainfall_Drought_Causal_Oxford_Caltech_Harvard_MIT_2020-2026.docx
+++ b/docs/literature/Literature_review_Stakeholder_Decisions_IV_Intense_Rainfall_Drought_Causal_Oxford_Caltech_Harvard_MIT_2020-2026.docx
@@ -309,13 +309,13 @@
           <w:bCs/>
           <w:b/>
         </w:rPr>
-        <w:t xml:space="preserve">Test on the variable-density section (2 aquifers, pilot, 6 weather sequences each).</w:t>
+        <w:t xml:space="preserve">Test on the variable-density section (20 aquifers, 6 weather sequences each).</w:t>
       </w:r>
       <w:r>
         <w:t xml:space="preserve"> </w:t>
       </w:r>
       <w:r>
-        <w:t xml:space="preserve">Without action the screen exceeds the standard in 9% of the seasons in ordinary weather and in 30%, 46% and 26% under the drought, the causal change and the compound event. With the decision rule</w:t>
+        <w:t xml:space="preserve">Without action the screen exceeds the standard in 25% of the seasons in ordinary weather and in 52%, 59% and 50% under the drought, the causal change and the compound event. With the decision rule</w:t>
       </w:r>
       <w:r>
         <w:t xml:space="preserve"> </w:t>
@@ -330,7 +330,7 @@
         <w:t xml:space="preserve">”</w:t>
       </w:r>
       <w:r>
-        <w:t xml:space="preserve">, the ROJA-GO watch keeps exceedance to 6%, 11% and 6% (yearly sample alone: 11%, 16%, 7%), with 91% of the planned water delivered in the drought.</w:t>
+        <w:t xml:space="preserve">, the ROJA-GO watch keeps exceedance to 4.7%, 9.1% and 4.3% (yearly sample alone: 5.9%, 11.5%, 5.1%; static alarm: 15.0%, 21.2%, 13.1%), with 73% of the planned water delivered in the drought.</w:t>
       </w:r>
     </w:p>
     <w:p>
@@ -343,10 +343,16 @@
       </w:pPr>
       <w:r>
         <w:rPr>
-          <w:iCs/>
-          <w:i/>
+          <w:bCs/>
+          <w:b/>
         </w:rPr>
-        <w:t xml:space="preserve">These are pilot numbers on 2 aquifers; the run on 20 aquifers will replace them.</w:t>
+        <w:t xml:space="preserve">The alarm stays valid in the extremes.</w:t>
+      </w:r>
+      <w:r>
+        <w:t xml:space="preserve"> </w:t>
+      </w:r>
+      <w:r>
+        <w:t xml:space="preserve">In open loop the ROJA-GO alarm under-warns in 2.7%–4.3% of the stress seasons (target ≤ 10%), against 3.5%–8.3% with the yearly sample alone; under the causal change the aquifers above the target fall from 6 to 2 of 20, for 6 extra samples in 30 years.</w:t>
       </w:r>
     </w:p>
     <w:bookmarkEnd w:id="20"/>
@@ -5189,7 +5195,7 @@
       </w:tr>
     </w:tbl>
     <w:bookmarkEnd w:id="26"/>
-    <w:bookmarkStart w:id="27" w:name="Xc20019cdf3a3dbcff1db5127d30496e87e74138"/>
+    <w:bookmarkStart w:id="30" w:name="Xc20019cdf3a3dbcff1db5127d30496e87e74138"/>
     <w:p>
       <w:pPr>
         <w:pStyle w:val="Heading2"/>
@@ -6293,13 +6299,13 @@
           <w:bCs/>
           <w:b/>
         </w:rPr>
-        <w:t xml:space="preserve">The stakeholder decision (closed loop).</w:t>
+        <w:t xml:space="preserve">The storylines.</w:t>
       </w:r>
       <w:r>
         <w:t xml:space="preserve"> </w:t>
       </w:r>
       <w:r>
-        <w:t xml:space="preserve">The utility pumps the decided +0.3 unless the alarm sounded in the previous season; then it pumps -0.3 (the risk-threshold rule of paper 7). For comparison: no action; a static alarm; yearly re-anchoring; and a continuous chloride sensor at the screen that cuts pumping when chloride reaches 89% of the standard.</w:t>
+        <w:t xml:space="preserve">All five use the same weather, so only the extreme differs. The drought averages −2 sd for six years; the worst six years of the 80-year record averaged -1.1 sd. The intense rainfall puts +2.5 sd on the gauge for two years, of which only a fifth infiltrates. In the causal change the farmers respond to the drought 3 times as strongly as in the record.</w:t>
       </w:r>
     </w:p>
     <w:p>
@@ -6307,7 +6313,25 @@
         <w:pStyle w:val="BodyText"/>
       </w:pPr>
       <w:r>
-        <w:t xml:space="preserve">Table 1. Share of seasons above 250 mg/L at the supply screen over 30 years after the decision, mean over 2 aquifers (pilot); in brackets the share of the planned water delivered.</w:t>
+        <w:rPr>
+          <w:bCs/>
+          <w:b/>
+        </w:rPr>
+        <w:t xml:space="preserve">The stakeholder decision (closed loop).</w:t>
+      </w:r>
+      <w:r>
+        <w:t xml:space="preserve"> </w:t>
+      </w:r>
+      <w:r>
+        <w:t xml:space="preserve">The utility pumps the decided +0.3 unless the alarm sounded in the previous season; then it pumps -0.3 (the risk-threshold rule of paper 7). For comparison: no action; a static alarm; yearly re-anchoring; and a continuous chloride sensor at the screen that cuts pumping when chloride reaches 89% of the standard.</w:t>
+      </w:r>
+    </w:p>
+    <w:p>
+      <w:pPr>
+        <w:pStyle w:val="BodyText"/>
+      </w:pPr>
+      <w:r>
+        <w:t xml:space="preserve">Table 1. Share of seasons above 250 mg/L at the supply screen over 30 years after the decision, mean over 20 aquifers; in brackets the share of the planned water delivered.</w:t>
       </w:r>
     </w:p>
     <w:tbl>
@@ -6473,7 +6497,7 @@
               <w:rPr>
                 <w:sz w:val="16"/>
               </w:rPr>
-              <w:t xml:space="preserve">9%</w:t>
+              <w:t xml:space="preserve">25.4%</w:t>
             </w:r>
           </w:p>
         </w:tc>
@@ -6488,7 +6512,7 @@
               <w:rPr>
                 <w:sz w:val="16"/>
               </w:rPr>
-              <w:t xml:space="preserve">2% (92%)</w:t>
+              <w:t xml:space="preserve">6.1% (84%)</w:t>
             </w:r>
           </w:p>
         </w:tc>
@@ -6503,7 +6527,7 @@
               <w:rPr>
                 <w:sz w:val="16"/>
               </w:rPr>
-              <w:t xml:space="preserve">3% (97%)</w:t>
+              <w:t xml:space="preserve">0.5% (81%)</w:t>
             </w:r>
           </w:p>
         </w:tc>
@@ -6518,7 +6542,7 @@
               <w:rPr>
                 <w:sz w:val="16"/>
               </w:rPr>
-              <w:t xml:space="preserve">2% (97%)</w:t>
+              <w:t xml:space="preserve">0.2% (80%)</w:t>
             </w:r>
           </w:p>
         </w:tc>
@@ -6533,7 +6557,7 @@
               <w:rPr>
                 <w:sz w:val="16"/>
               </w:rPr>
-              <w:t xml:space="preserve">3% (97%)</w:t>
+              <w:t xml:space="preserve">6.3% (94%)</w:t>
             </w:r>
           </w:p>
         </w:tc>
@@ -6565,7 +6589,7 @@
               <w:rPr>
                 <w:sz w:val="16"/>
               </w:rPr>
-              <w:t xml:space="preserve">7%</w:t>
+              <w:t xml:space="preserve">23.8%</w:t>
             </w:r>
           </w:p>
         </w:tc>
@@ -6580,7 +6604,7 @@
               <w:rPr>
                 <w:sz w:val="16"/>
               </w:rPr>
-              <w:t xml:space="preserve">1% (91%)</w:t>
+              <w:t xml:space="preserve">4.6% (83%)</w:t>
             </w:r>
           </w:p>
         </w:tc>
@@ -6595,7 +6619,7 @@
               <w:rPr>
                 <w:sz w:val="16"/>
               </w:rPr>
-              <w:t xml:space="preserve">2% (97%)</w:t>
+              <w:t xml:space="preserve">0.3% (81%)</w:t>
             </w:r>
           </w:p>
         </w:tc>
@@ -6610,7 +6634,7 @@
               <w:rPr>
                 <w:sz w:val="16"/>
               </w:rPr>
-              <w:t xml:space="preserve">2% (97%)</w:t>
+              <w:t xml:space="preserve">0.2% (81%)</w:t>
             </w:r>
           </w:p>
         </w:tc>
@@ -6625,7 +6649,7 @@
               <w:rPr>
                 <w:sz w:val="16"/>
               </w:rPr>
-              <w:t xml:space="preserve">3% (98%)</w:t>
+              <w:t xml:space="preserve">5.9% (95%)</w:t>
             </w:r>
           </w:p>
         </w:tc>
@@ -6657,7 +6681,7 @@
               <w:rPr>
                 <w:sz w:val="16"/>
               </w:rPr>
-              <w:t xml:space="preserve">30%</w:t>
+              <w:t xml:space="preserve">52.1%</w:t>
             </w:r>
           </w:p>
         </w:tc>
@@ -6672,7 +6696,7 @@
               <w:rPr>
                 <w:sz w:val="16"/>
               </w:rPr>
-              <w:t xml:space="preserve">12% (92%)</w:t>
+              <w:t xml:space="preserve">15.0% (78%)</w:t>
             </w:r>
           </w:p>
         </w:tc>
@@ -6687,7 +6711,7 @@
               <w:rPr>
                 <w:sz w:val="16"/>
               </w:rPr>
-              <w:t xml:space="preserve">11% (92%)</w:t>
+              <w:t xml:space="preserve">5.9% (74%)</w:t>
             </w:r>
           </w:p>
         </w:tc>
@@ -6702,7 +6726,7 @@
               <w:rPr>
                 <w:sz w:val="16"/>
               </w:rPr>
-              <w:t xml:space="preserve">6% (91%)</w:t>
+              <w:t xml:space="preserve">4.7% (73%)</w:t>
             </w:r>
           </w:p>
         </w:tc>
@@ -6717,7 +6741,7 @@
               <w:rPr>
                 <w:sz w:val="16"/>
               </w:rPr>
-              <w:t xml:space="preserve">9% (93%)</w:t>
+              <w:t xml:space="preserve">18.0% (87%)</w:t>
             </w:r>
           </w:p>
         </w:tc>
@@ -6749,7 +6773,7 @@
               <w:rPr>
                 <w:sz w:val="16"/>
               </w:rPr>
-              <w:t xml:space="preserve">46%</w:t>
+              <w:t xml:space="preserve">59.3%</w:t>
             </w:r>
           </w:p>
         </w:tc>
@@ -6764,7 +6788,7 @@
               <w:rPr>
                 <w:sz w:val="16"/>
               </w:rPr>
-              <w:t xml:space="preserve">22% (92%)</w:t>
+              <w:t xml:space="preserve">21.2% (76%)</w:t>
             </w:r>
           </w:p>
         </w:tc>
@@ -6779,7 +6803,7 @@
               <w:rPr>
                 <w:sz w:val="16"/>
               </w:rPr>
-              <w:t xml:space="preserve">16% (89%)</w:t>
+              <w:t xml:space="preserve">11.5% (72%)</w:t>
             </w:r>
           </w:p>
         </w:tc>
@@ -6794,7 +6818,7 @@
               <w:rPr>
                 <w:sz w:val="16"/>
               </w:rPr>
-              <w:t xml:space="preserve">11% (88%)</w:t>
+              <w:t xml:space="preserve">9.1% (71%)</w:t>
             </w:r>
           </w:p>
         </w:tc>
@@ -6809,7 +6833,7 @@
               <w:rPr>
                 <w:sz w:val="16"/>
               </w:rPr>
-              <w:t xml:space="preserve">13% (89%)</w:t>
+              <w:t xml:space="preserve">24.5% (84%)</w:t>
             </w:r>
           </w:p>
         </w:tc>
@@ -6841,7 +6865,7 @@
               <w:rPr>
                 <w:sz w:val="16"/>
               </w:rPr>
-              <w:t xml:space="preserve">26%</w:t>
+              <w:t xml:space="preserve">49.8%</w:t>
             </w:r>
           </w:p>
         </w:tc>
@@ -6856,7 +6880,7 @@
               <w:rPr>
                 <w:sz w:val="16"/>
               </w:rPr>
-              <w:t xml:space="preserve">7% (91%)</w:t>
+              <w:t xml:space="preserve">13.1% (77%)</w:t>
             </w:r>
           </w:p>
         </w:tc>
@@ -6871,7 +6895,7 @@
               <w:rPr>
                 <w:sz w:val="16"/>
               </w:rPr>
-              <w:t xml:space="preserve">7% (92%)</w:t>
+              <w:t xml:space="preserve">5.1% (75%)</w:t>
             </w:r>
           </w:p>
         </w:tc>
@@ -6886,7 +6910,7 @@
               <w:rPr>
                 <w:sz w:val="16"/>
               </w:rPr>
-              <w:t xml:space="preserve">6% (92%)</w:t>
+              <w:t xml:space="preserve">4.3% (74%)</w:t>
             </w:r>
           </w:p>
         </w:tc>
@@ -6901,7 +6925,7 @@
               <w:rPr>
                 <w:sz w:val="16"/>
               </w:rPr>
-              <w:t xml:space="preserve">8% (93%)</w:t>
+              <w:t xml:space="preserve">17.2% (88%)</w:t>
             </w:r>
           </w:p>
         </w:tc>
@@ -6909,10 +6933,83 @@
     </w:tbl>
     <w:p>
       <w:pPr>
+        <w:pStyle w:val="CaptionedFigure"/>
+      </w:pPr>
+      <w:r>
+        <w:drawing>
+          <wp:inline>
+            <wp:extent cx="5334000" cy="1921216"/>
+            <wp:effectExtent b="0" l="0" r="0" t="0"/>
+            <wp:docPr descr="Figure 1. (a) Share of seasons above 250 mg/L at the supply screen with the rule “cut pumping after an alarm” (dot: mean over 20 aquifers; line: 10–90% range). (b) One aquifer in the record drought, open loop: chloride at the screen, the yearly re-anchored prediction and the ROJA-GO prediction; ticks: seasons when the watch fires and an extra sample is taken." title="" id="28" name="Picture"/>
+            <a:graphic>
+              <a:graphicData uri="http://schemas.openxmlformats.org/drawingml/2006/picture">
+                <pic:pic>
+                  <pic:nvPicPr>
+                    <pic:cNvPr descr="/home/user/swi-goal-oed/experiments/spiranca_go/res/figR1_extremes.png" id="29" name="Picture"/>
+                    <pic:cNvPicPr>
+                      <a:picLocks noChangeArrowheads="1" noChangeAspect="1"/>
+                    </pic:cNvPicPr>
+                  </pic:nvPicPr>
+                  <pic:blipFill>
+                    <a:blip r:embed="rId27"/>
+                    <a:stretch>
+                      <a:fillRect/>
+                    </a:stretch>
+                  </pic:blipFill>
+                  <pic:spPr bwMode="auto">
+                    <a:xfrm>
+                      <a:off x="0" y="0"/>
+                      <a:ext cx="5334000" cy="1921216"/>
+                    </a:xfrm>
+                    <a:prstGeom prst="rect">
+                      <a:avLst/>
+                    </a:prstGeom>
+                    <a:noFill/>
+                    <a:ln w="9525">
+                      <a:noFill/>
+                      <a:headEnd/>
+                      <a:tailEnd/>
+                    </a:ln>
+                  </pic:spPr>
+                </pic:pic>
+              </a:graphicData>
+            </a:graphic>
+          </wp:inline>
+        </w:drawing>
+      </w:r>
+    </w:p>
+    <w:p>
+      <w:pPr>
+        <w:pStyle w:val="ImageCaption"/>
+      </w:pPr>
+      <w:r>
+        <w:t xml:space="preserve">Figure 1. (a) Share of seasons above 250 mg/L at the supply screen with the rule</w:t>
+      </w:r>
+      <w:r>
+        <w:t xml:space="preserve"> </w:t>
+      </w:r>
+      <w:r>
+        <w:t xml:space="preserve">“</w:t>
+      </w:r>
+      <w:r>
+        <w:t xml:space="preserve">cut pumping after an alarm</w:t>
+      </w:r>
+      <w:r>
+        <w:t xml:space="preserve">”</w:t>
+      </w:r>
+      <w:r>
+        <w:t xml:space="preserve"> </w:t>
+      </w:r>
+      <w:r>
+        <w:t xml:space="preserve">(dot: mean over 20 aquifers; line: 10–90% range). (b) One aquifer in the record drought, open loop: chloride at the screen, the yearly re-anchored prediction and the ROJA-GO prediction; ticks: seasons when the watch fires and an extra sample is taken.</w:t>
+      </w:r>
+    </w:p>
+    <w:p>
+      <w:pPr>
         <w:pStyle w:val="BodyText"/>
       </w:pPr>
       <w:r>
-        <w:t xml:space="preserve">Table 2. Alarm validity in open loop (no curtailment): share of seasons in the stress period in which the alarm under-warns by more than its margin (target ≤ 10%), mean over 2 aquifers; in brackets the aquifers above the target; and chloride samples in 30 years.</w:t>
+        <w:t xml:space="preserve">Table 2. Alarm validity in open loop (no curtailment): share of seasons in the stress period in which the alarm under-warns by more than its margin (target ≤ 10%), mean over 20 aquifers; in brackets the aquifers above the target; and chloride samples in 30 years.</w:t>
       </w:r>
     </w:p>
     <w:tbl>
@@ -7097,7 +7194,7 @@
               <w:rPr>
                 <w:sz w:val="16"/>
               </w:rPr>
-              <w:t xml:space="preserve">35.6% (1)</w:t>
+              <w:t xml:space="preserve">26.1% (10)</w:t>
             </w:r>
           </w:p>
         </w:tc>
@@ -7112,7 +7209,7 @@
               <w:rPr>
                 <w:sz w:val="16"/>
               </w:rPr>
-              <w:t xml:space="preserve">28.2% (1)</w:t>
+              <w:t xml:space="preserve">3.5% (2)</w:t>
             </w:r>
           </w:p>
         </w:tc>
@@ -7127,7 +7224,7 @@
               <w:rPr>
                 <w:sz w:val="16"/>
               </w:rPr>
-              <w:t xml:space="preserve">26.9% (1)</w:t>
+              <w:t xml:space="preserve">3.3% (2)</w:t>
             </w:r>
           </w:p>
         </w:tc>
@@ -7142,7 +7239,7 @@
               <w:rPr>
                 <w:sz w:val="16"/>
               </w:rPr>
-              <w:t xml:space="preserve">24.4% (1)</w:t>
+              <w:t xml:space="preserve">3.0% (2)</w:t>
             </w:r>
           </w:p>
         </w:tc>
@@ -7157,7 +7254,7 @@
               <w:rPr>
                 <w:sz w:val="16"/>
               </w:rPr>
-              <w:t xml:space="preserve">22.5% (1)</w:t>
+              <w:t xml:space="preserve">2.7% (1)</w:t>
             </w:r>
           </w:p>
         </w:tc>
@@ -7172,7 +7269,7 @@
               <w:rPr>
                 <w:sz w:val="16"/>
               </w:rPr>
-              <w:t xml:space="preserve">65.1% (2)</w:t>
+              <w:t xml:space="preserve">24.5% (8)</w:t>
             </w:r>
           </w:p>
         </w:tc>
@@ -7204,7 +7301,7 @@
               <w:rPr>
                 <w:sz w:val="16"/>
               </w:rPr>
-              <w:t xml:space="preserve">50.0% (1)</w:t>
+              <w:t xml:space="preserve">23.7% (7)</w:t>
             </w:r>
           </w:p>
         </w:tc>
@@ -7219,7 +7316,7 @@
               <w:rPr>
                 <w:sz w:val="16"/>
               </w:rPr>
-              <w:t xml:space="preserve">29.9% (1)</w:t>
+              <w:t xml:space="preserve">4.7% (3)</w:t>
             </w:r>
           </w:p>
         </w:tc>
@@ -7234,7 +7331,7 @@
               <w:rPr>
                 <w:sz w:val="16"/>
               </w:rPr>
-              <w:t xml:space="preserve">25.7% (1)</w:t>
+              <w:t xml:space="preserve">4.5% (3)</w:t>
             </w:r>
           </w:p>
         </w:tc>
@@ -7249,7 +7346,7 @@
               <w:rPr>
                 <w:sz w:val="16"/>
               </w:rPr>
-              <w:t xml:space="preserve">27.1% (1)</w:t>
+              <w:t xml:space="preserve">4.2% (2)</w:t>
             </w:r>
           </w:p>
         </w:tc>
@@ -7264,7 +7361,7 @@
               <w:rPr>
                 <w:sz w:val="16"/>
               </w:rPr>
-              <w:t xml:space="preserve">18.1% (1)</w:t>
+              <w:t xml:space="preserve">3.3% (3)</w:t>
             </w:r>
           </w:p>
         </w:tc>
@@ -7279,7 +7376,7 @@
               <w:rPr>
                 <w:sz w:val="16"/>
               </w:rPr>
-              <w:t xml:space="preserve">67.4% (2)</w:t>
+              <w:t xml:space="preserve">28.0% (8)</w:t>
             </w:r>
           </w:p>
         </w:tc>
@@ -7311,7 +7408,7 @@
               <w:rPr>
                 <w:sz w:val="16"/>
               </w:rPr>
-              <w:t xml:space="preserve">50.0% (1)</w:t>
+              <w:t xml:space="preserve">26.7% (12)</w:t>
             </w:r>
           </w:p>
         </w:tc>
@@ -7326,7 +7423,7 @@
               <w:rPr>
                 <w:sz w:val="16"/>
               </w:rPr>
-              <w:t xml:space="preserve">39.6% (1)</w:t>
+              <w:t xml:space="preserve">6.9% (3)</w:t>
             </w:r>
           </w:p>
         </w:tc>
@@ -7341,7 +7438,7 @@
               <w:rPr>
                 <w:sz w:val="16"/>
               </w:rPr>
-              <w:t xml:space="preserve">35.0% (1)</w:t>
+              <w:t xml:space="preserve">5.0% (1)</w:t>
             </w:r>
           </w:p>
         </w:tc>
@@ -7356,7 +7453,7 @@
               <w:rPr>
                 <w:sz w:val="16"/>
               </w:rPr>
-              <w:t xml:space="preserve">36.7% (1)</w:t>
+              <w:t xml:space="preserve">5.4% (2)</w:t>
             </w:r>
           </w:p>
         </w:tc>
@@ -7371,7 +7468,7 @@
               <w:rPr>
                 <w:sz w:val="16"/>
               </w:rPr>
-              <w:t xml:space="preserve">30.8% (1)</w:t>
+              <w:t xml:space="preserve">3.8% (1)</w:t>
             </w:r>
           </w:p>
         </w:tc>
@@ -7386,7 +7483,7 @@
               <w:rPr>
                 <w:sz w:val="16"/>
               </w:rPr>
-              <w:t xml:space="preserve">71.7% (2)</w:t>
+              <w:t xml:space="preserve">23.1% (8)</w:t>
             </w:r>
           </w:p>
         </w:tc>
@@ -7418,7 +7515,7 @@
               <w:rPr>
                 <w:sz w:val="16"/>
               </w:rPr>
-              <w:t xml:space="preserve">50.0% (1)</w:t>
+              <w:t xml:space="preserve">21.5% (10)</w:t>
             </w:r>
           </w:p>
         </w:tc>
@@ -7433,7 +7530,7 @@
               <w:rPr>
                 <w:sz w:val="16"/>
               </w:rPr>
-              <w:t xml:space="preserve">47.9% (2)</w:t>
+              <w:t xml:space="preserve">8.3% (6)</w:t>
             </w:r>
           </w:p>
         </w:tc>
@@ -7448,7 +7545,7 @@
               <w:rPr>
                 <w:sz w:val="16"/>
               </w:rPr>
-              <w:t xml:space="preserve">39.2% (1)</w:t>
+              <w:t xml:space="preserve">6.9% (4)</w:t>
             </w:r>
           </w:p>
         </w:tc>
@@ -7463,7 +7560,7 @@
               <w:rPr>
                 <w:sz w:val="16"/>
               </w:rPr>
-              <w:t xml:space="preserve">44.6% (1)</w:t>
+              <w:t xml:space="preserve">6.7% (3)</w:t>
             </w:r>
           </w:p>
         </w:tc>
@@ -7478,7 +7575,7 @@
               <w:rPr>
                 <w:sz w:val="16"/>
               </w:rPr>
-              <w:t xml:space="preserve">28.3% (1)</w:t>
+              <w:t xml:space="preserve">4.3% (2)</w:t>
             </w:r>
           </w:p>
         </w:tc>
@@ -7493,7 +7590,7 @@
               <w:rPr>
                 <w:sz w:val="16"/>
               </w:rPr>
-              <w:t xml:space="preserve">75.0% (2)</w:t>
+              <w:t xml:space="preserve">24.5% (9)</w:t>
             </w:r>
           </w:p>
         </w:tc>
@@ -7525,7 +7622,7 @@
               <w:rPr>
                 <w:sz w:val="16"/>
               </w:rPr>
-              <w:t xml:space="preserve">50.0% (1)</w:t>
+              <w:t xml:space="preserve">23.2% (10)</w:t>
             </w:r>
           </w:p>
         </w:tc>
@@ -7540,7 +7637,7 @@
               <w:rPr>
                 <w:sz w:val="16"/>
               </w:rPr>
-              <w:t xml:space="preserve">35.4% (1)</w:t>
+              <w:t xml:space="preserve">6.2% (3)</w:t>
             </w:r>
           </w:p>
         </w:tc>
@@ -7555,7 +7652,7 @@
               <w:rPr>
                 <w:sz w:val="16"/>
               </w:rPr>
-              <w:t xml:space="preserve">32.6% (1)</w:t>
+              <w:t xml:space="preserve">5.0% (2)</w:t>
             </w:r>
           </w:p>
         </w:tc>
@@ -7570,7 +7667,7 @@
               <w:rPr>
                 <w:sz w:val="16"/>
               </w:rPr>
-              <w:t xml:space="preserve">31.6% (1)</w:t>
+              <w:t xml:space="preserve">4.8% (2)</w:t>
             </w:r>
           </w:p>
         </w:tc>
@@ -7585,7 +7682,7 @@
               <w:rPr>
                 <w:sz w:val="16"/>
               </w:rPr>
-              <w:t xml:space="preserve">28.1% (1)</w:t>
+              <w:t xml:space="preserve">3.7% (1)</w:t>
             </w:r>
           </w:p>
         </w:tc>
@@ -7600,7 +7697,7 @@
               <w:rPr>
                 <w:sz w:val="16"/>
               </w:rPr>
-              <w:t xml:space="preserve">70.1% (2)</w:t>
+              <w:t xml:space="preserve">24.9% (9)</w:t>
             </w:r>
           </w:p>
         </w:tc>
@@ -7662,7 +7759,7 @@
               <w:rPr>
                 <w:sz w:val="16"/>
               </w:rPr>
-              <w:t xml:space="preserve">39</w:t>
+              <w:t xml:space="preserve">36</w:t>
             </w:r>
           </w:p>
         </w:tc>
@@ -7692,7 +7789,7 @@
               <w:rPr>
                 <w:sz w:val="16"/>
               </w:rPr>
-              <w:t xml:space="preserve">39</w:t>
+              <w:t xml:space="preserve">36</w:t>
             </w:r>
           </w:p>
         </w:tc>
@@ -7707,7 +7804,7 @@
               <w:rPr>
                 <w:sz w:val="16"/>
               </w:rPr>
-              <w:t xml:space="preserve">39</w:t>
+              <w:t xml:space="preserve">36</w:t>
             </w:r>
           </w:p>
         </w:tc>
@@ -7728,7 +7825,7 @@
         <w:t xml:space="preserve"> </w:t>
       </w:r>
       <w:r>
-        <w:t xml:space="preserve">(1) The extremes, not the decision, now drive the risk: the drought multiplies the exceeding seasons by 3.5 and the causal change by 5.4. (2) The detectors fire in 66% of the seasons of an extreme and 17% outside it, so the extra samples go where the drift is. (3) In the three drought storylines a continuous sensor that reacts at 89% of the standard leaves 10% of the seasons above it, against 8% with ROJA-GO: the aquifer has memory, so acting at the standard is late, and the certified margin acts earlier. (4) The certificate is still needed: least squares with the same watch under-warns in 70% of the stress seasons.</w:t>
+        <w:t xml:space="preserve">(1) The extremes, not the decision, now drive the risk: the drought multiplies the exceeding seasons by 2.1 and the causal change by 2.3. (2) The detectors fire in 49% of the seasons of an extreme and 9% outside it, so the extra samples go where the drift is. (3) In the three drought storylines a continuous sensor that reacts at 89% of the standard leaves 20% of the seasons above it, against 6% with ROJA-GO: the aquifer has memory, so acting at the standard is late, and the certified margin acts earlier. (4) The certificate is still needed: least squares with the same watch under-warns in 25% of the stress seasons.</w:t>
       </w:r>
     </w:p>
     <w:p>
@@ -7793,8 +7890,8 @@
         <w:t xml:space="preserve">that would overturn it (paper 5).</w:t>
       </w:r>
     </w:p>
-    <w:bookmarkEnd w:id="27"/>
-    <w:bookmarkStart w:id="28" w:name="verification-and-caveats"/>
+    <w:bookmarkEnd w:id="30"/>
+    <w:bookmarkStart w:id="31" w:name="verification-and-caveats"/>
     <w:p>
       <w:pPr>
         <w:pStyle w:val="Heading2"/>
@@ -7851,7 +7948,7 @@
         <w:t xml:space="preserve">Code: experiments/spiranca_go/sx_run.py (storylines, watch, closed loop); results res/sx.json. All 20 papers are new to this series: none is in the 3,162 references of the earlier reviews.</w:t>
       </w:r>
     </w:p>
-    <w:bookmarkEnd w:id="28"/>
+    <w:bookmarkEnd w:id="31"/>
     <w:sectPr>
       <w:pgSz w:orient="landscape" w:w="16838" w:h="11906"/>
       <w:pgMar w:left="907" w:right="907" w:top="850" w:bottom="850"/>

</xml_diff>

<commit_message>
Assembly of the equations and the solution algorithm (Word, OMML) with coupling diagram and flowchart; larger type in all three notes
- New note: equations (1)-(14) (flow with memory, Darcy with buoyancy, salt with
  immobile zones, dispersion, ions, boundaries, initial state, goal, the discrete
  step and chord Newton, adjoint, decision layer), Figure 1 (coupling), Figure 2
  (flowchart), Algorithm 1 with measured costs (30 ms and 6.4 Newton iterations
  per season).
- Larger text in the diagrams, the results figure and the Word notes (body 12 pt,
  tables 10.5 pt); images now at full landscape width.

Co-Authored-By: Claude Opus 5.5 <noreply@anthropic.com>
Claude-Session: https://claude.ai/code/session_016Cdcj2FTAQGBVsJUyYJR2M
</commit_message>
<xml_diff>
--- a/docs/literature/Literature_review_Stakeholder_Decisions_IV_Intense_Rainfall_Drought_Causal_Oxford_Caltech_Harvard_MIT_2020-2026.docx
+++ b/docs/literature/Literature_review_Stakeholder_Decisions_IV_Intense_Rainfall_Drought_Causal_Oxford_Caltech_Harvard_MIT_2020-2026.docx
@@ -423,7 +423,7 @@
             <w:r>
               <w:rPr>
                 <w:b/>
-                <w:sz w:val="16"/>
+                <w:sz w:val="19"/>
               </w:rPr>
               <w:t xml:space="preserve">#</w:t>
             </w:r>
@@ -442,7 +442,7 @@
             <w:r>
               <w:rPr>
                 <w:b/>
-                <w:sz w:val="16"/>
+                <w:sz w:val="19"/>
               </w:rPr>
               <w:t xml:space="preserve">Paper</w:t>
             </w:r>
@@ -461,7 +461,7 @@
             <w:r>
               <w:rPr>
                 <w:b/>
-                <w:sz w:val="16"/>
+                <w:sz w:val="19"/>
               </w:rPr>
               <w:t xml:space="preserve">Situation</w:t>
             </w:r>
@@ -480,7 +480,7 @@
             <w:r>
               <w:rPr>
                 <w:b/>
-                <w:sz w:val="16"/>
+                <w:sz w:val="19"/>
               </w:rPr>
               <w:t xml:space="preserve">Mathematical tool for the decision</w:t>
             </w:r>
@@ -499,7 +499,7 @@
             <w:r>
               <w:rPr>
                 <w:b/>
-                <w:sz w:val="16"/>
+                <w:sz w:val="19"/>
               </w:rPr>
               <w:t xml:space="preserve">What it changes in our model</w:t>
             </w:r>
@@ -518,7 +518,7 @@
             <w:r>
               <w:rPr>
                 <w:b/>
-                <w:sz w:val="16"/>
+                <w:sz w:val="19"/>
               </w:rPr>
               <w:t xml:space="preserve">Innovation</w:t>
             </w:r>
@@ -537,7 +537,7 @@
             </w:pPr>
             <w:r>
               <w:rPr>
-                <w:sz w:val="16"/>
+                <w:sz w:val="19"/>
               </w:rPr>
               <w:t xml:space="preserve">1</w:t>
             </w:r>
@@ -554,7 +554,7 @@
             </w:pPr>
             <w:r>
               <w:rPr>
-                <w:sz w:val="16"/>
+                <w:sz w:val="19"/>
               </w:rPr>
               <w:t xml:space="preserve">Kelder, Müller, Slater, … Nipen (2020). Using UNSEEN trends to detect decadal changes in 100-year precipitation extremes. npj Clim. Atmos. Sci. 3, 47. doi:10.1038/s41612-020-00149-4</w:t>
             </w:r>
@@ -571,7 +571,7 @@
             </w:pPr>
             <w:r>
               <w:rPr>
-                <w:sz w:val="16"/>
+                <w:sz w:val="19"/>
               </w:rPr>
               <w:t xml:space="preserve">Intense rainfall</w:t>
             </w:r>
@@ -588,49 +588,49 @@
             </w:pPr>
             <w:r>
               <w:rPr>
-                <w:sz w:val="16"/>
+                <w:sz w:val="19"/>
               </w:rPr>
               <w:t xml:space="preserve">UNSEEN: pool seasonal-forecast members and lead times into ~3,500</w:t>
             </w:r>
             <w:r>
               <w:rPr>
-                <w:sz w:val="16"/>
+                <w:sz w:val="19"/>
               </w:rPr>
               <w:t xml:space="preserve"> </w:t>
             </w:r>
             <w:r>
               <w:rPr>
-                <w:sz w:val="16"/>
+                <w:sz w:val="19"/>
               </w:rPr>
               <w:t xml:space="preserve">“</w:t>
             </w:r>
             <w:r>
               <w:rPr>
-                <w:sz w:val="16"/>
+                <w:sz w:val="19"/>
               </w:rPr>
               <w:t xml:space="preserve">years</w:t>
             </w:r>
             <w:r>
               <w:rPr>
-                <w:sz w:val="16"/>
+                <w:sz w:val="19"/>
               </w:rPr>
               <w:t xml:space="preserve">”</w:t>
             </w:r>
             <w:r>
               <w:rPr>
-                <w:sz w:val="16"/>
+                <w:sz w:val="19"/>
               </w:rPr>
               <w:t xml:space="preserve"> </w:t>
             </w:r>
             <w:r>
               <w:rPr>
-                <w:sz w:val="16"/>
+                <w:sz w:val="19"/>
               </w:rPr>
               <w:t xml:space="preserve">(≈100× the record) and fit a GEV with drifting location and scale,</w:t>
             </w:r>
             <w:r>
               <w:rPr>
-                <w:sz w:val="16"/>
+                <w:sz w:val="19"/>
               </w:rPr>
               <w:t xml:space="preserve"> </w:t>
             </w:r>
@@ -693,7 +693,7 @@
             </m:oMath>
             <w:r>
               <w:rPr>
-                <w:sz w:val="16"/>
+                <w:sz w:val="19"/>
               </w:rPr>
               <w:t xml:space="preserve">, after tests of member independence, lead-time stability and fidelity.</w:t>
             </w:r>
@@ -710,13 +710,13 @@
             </w:pPr>
             <w:r>
               <w:rPr>
-                <w:sz w:val="16"/>
+                <w:sz w:val="19"/>
               </w:rPr>
               <w:t xml:space="preserve">Sets the extreme recharge inputs and the shift radius</w:t>
             </w:r>
             <w:r>
               <w:rPr>
-                <w:sz w:val="16"/>
+                <w:sz w:val="19"/>
               </w:rPr>
               <w:t xml:space="preserve"> </w:t>
             </w:r>
@@ -734,13 +734,13 @@
             </m:oMath>
             <w:r>
               <w:rPr>
-                <w:sz w:val="16"/>
+                <w:sz w:val="19"/>
               </w:rPr>
               <w:t xml:space="preserve"> </w:t>
             </w:r>
             <w:r>
               <w:rPr>
-                <w:sz w:val="16"/>
+                <w:sz w:val="19"/>
               </w:rPr>
               <w:t xml:space="preserve">of the SPIRANCA-GO margin from the pooled ensemble, not from the 80-year record; widens the storylines the alarm must survive.</w:t>
             </w:r>
@@ -757,13 +757,13 @@
             </w:pPr>
             <w:r>
               <w:rPr>
-                <w:sz w:val="16"/>
+                <w:sz w:val="19"/>
               </w:rPr>
               <w:t xml:space="preserve">UNSEEN-certified margin:</w:t>
             </w:r>
             <w:r>
               <w:rPr>
-                <w:sz w:val="16"/>
+                <w:sz w:val="19"/>
               </w:rPr>
               <w:t xml:space="preserve"> </w:t>
             </w:r>
@@ -781,13 +781,13 @@
             </m:oMath>
             <w:r>
               <w:rPr>
-                <w:sz w:val="16"/>
+                <w:sz w:val="19"/>
               </w:rPr>
               <w:t xml:space="preserve"> </w:t>
             </w:r>
             <w:r>
               <w:rPr>
-                <w:sz w:val="16"/>
+                <w:sz w:val="19"/>
               </w:rPr>
               <w:t xml:space="preserve">= UNSEEN 100-year anomaly of the gauge.</w:t>
             </w:r>
@@ -806,7 +806,7 @@
             </w:pPr>
             <w:r>
               <w:rPr>
-                <w:sz w:val="16"/>
+                <w:sz w:val="19"/>
               </w:rPr>
               <w:t xml:space="preserve">2</w:t>
             </w:r>
@@ -823,7 +823,7 @@
             </w:pPr>
             <w:r>
               <w:rPr>
-                <w:sz w:val="16"/>
+                <w:sz w:val="19"/>
               </w:rPr>
               <w:t xml:space="preserve">Kew, Philip, Hauser, … Funk, Otto (2021). Impact of precipitation and increasing temperatures on drought trends in eastern Africa. Earth Syst. Dynam. 12, 17–35. doi:10.5194/esd-12-17-2021</w:t>
             </w:r>
@@ -840,7 +840,7 @@
             </w:pPr>
             <w:r>
               <w:rPr>
-                <w:sz w:val="16"/>
+                <w:sz w:val="19"/>
               </w:rPr>
               <w:t xml:space="preserve">Drought; causal attribution</w:t>
             </w:r>
@@ -857,13 +857,13 @@
             </w:pPr>
             <w:r>
               <w:rPr>
-                <w:sz w:val="16"/>
+                <w:sz w:val="19"/>
               </w:rPr>
               <w:t xml:space="preserve">Probabilistic event attribution: probability ratio</w:t>
             </w:r>
             <w:r>
               <w:rPr>
-                <w:sz w:val="16"/>
+                <w:sz w:val="19"/>
               </w:rPr>
               <w:t xml:space="preserve"> </w:t>
             </w:r>
@@ -913,13 +913,13 @@
             </m:oMath>
             <w:r>
               <w:rPr>
-                <w:sz w:val="16"/>
+                <w:sz w:val="19"/>
               </w:rPr>
               <w:t xml:space="preserve"> </w:t>
             </w:r>
             <w:r>
               <w:rPr>
-                <w:sz w:val="16"/>
+                <w:sz w:val="19"/>
               </w:rPr>
               <w:t xml:space="preserve">of a drought index in the factual and counterfactual climate, per driver.</w:t>
             </w:r>
@@ -936,13 +936,13 @@
             </w:pPr>
             <w:r>
               <w:rPr>
-                <w:sz w:val="16"/>
+                <w:sz w:val="19"/>
               </w:rPr>
               <w:t xml:space="preserve">Warming can dry the aquifer through evaporation while rainfall is unchanged: that shift lies outside the anchor span</w:t>
             </w:r>
             <w:r>
               <w:rPr>
-                <w:sz w:val="16"/>
+                <w:sz w:val="19"/>
               </w:rPr>
               <w:t xml:space="preserve"> </w:t>
             </w:r>
@@ -974,7 +974,7 @@
             </m:oMath>
             <w:r>
               <w:rPr>
-                <w:sz w:val="16"/>
+                <w:sz w:val="19"/>
               </w:rPr>
               <w:t xml:space="preserve">, so the certificate does not cover it. Push: add an evaporation (temperature) anchor.</w:t>
             </w:r>
@@ -991,7 +991,7 @@
             </w:pPr>
             <w:r>
               <w:rPr>
-                <w:sz w:val="16"/>
+                <w:sz w:val="19"/>
               </w:rPr>
               <w:t xml:space="preserve">Span test before certifying: is the attributed driver in span(anchors)?</w:t>
             </w:r>
@@ -1010,7 +1010,7 @@
             </w:pPr>
             <w:r>
               <w:rPr>
-                <w:sz w:val="16"/>
+                <w:sz w:val="19"/>
               </w:rPr>
               <w:t xml:space="preserve">3</w:t>
             </w:r>
@@ -1027,7 +1027,7 @@
             </w:pPr>
             <w:r>
               <w:rPr>
-                <w:sz w:val="16"/>
+                <w:sz w:val="19"/>
               </w:rPr>
               <w:t xml:space="preserve">Murgatroyd &amp; Hall (2020). The resilience of inter-basin transfers to severe droughts with changing spatial characteristics. Front. Environ. Sci. 8, 571647. doi:10.3389/fenvs.2020.571647</w:t>
             </w:r>
@@ -1044,7 +1044,7 @@
             </w:pPr>
             <w:r>
               <w:rPr>
-                <w:sz w:val="16"/>
+                <w:sz w:val="19"/>
               </w:rPr>
               <w:t xml:space="preserve">Drought; planning</w:t>
             </w:r>
@@ -1061,7 +1061,7 @@
             </w:pPr>
             <w:r>
               <w:rPr>
-                <w:sz w:val="16"/>
+                <w:sz w:val="19"/>
               </w:rPr>
               <w:t xml:space="preserve">Stochastic, spatially coherent severe-drought scenarios; resilience of a supply system with transfers and storage under joint drought.</w:t>
             </w:r>
@@ -1078,13 +1078,13 @@
             </w:pPr>
             <w:r>
               <w:rPr>
-                <w:sz w:val="16"/>
+                <w:sz w:val="19"/>
               </w:rPr>
               <w:t xml:space="preserve">Well placement judged on joint failure (chloride above 250 mg/L when the back-up source also fails); both depend on the same drought, so</w:t>
             </w:r>
             <w:r>
               <w:rPr>
-                <w:sz w:val="16"/>
+                <w:sz w:val="19"/>
               </w:rPr>
               <w:t xml:space="preserve"> </w:t>
             </w:r>
@@ -1155,7 +1155,7 @@
             </m:oMath>
             <w:r>
               <w:rPr>
-                <w:sz w:val="16"/>
+                <w:sz w:val="19"/>
               </w:rPr>
               <w:t xml:space="preserve">.</w:t>
             </w:r>
@@ -1172,7 +1172,7 @@
             </w:pPr>
             <w:r>
               <w:rPr>
-                <w:sz w:val="16"/>
+                <w:sz w:val="19"/>
               </w:rPr>
               <w:t xml:space="preserve">Joint-failure objective for siting the supply well.</w:t>
             </w:r>
@@ -1191,7 +1191,7 @@
             </w:pPr>
             <w:r>
               <w:rPr>
-                <w:sz w:val="16"/>
+                <w:sz w:val="19"/>
               </w:rPr>
               <w:t xml:space="preserve">4</w:t>
             </w:r>
@@ -1208,7 +1208,7 @@
             </w:pPr>
             <w:r>
               <w:rPr>
-                <w:sz w:val="16"/>
+                <w:sz w:val="19"/>
               </w:rPr>
               <w:t xml:space="preserve">Becher, Pant, Verschuur, … Hall (2023). A multi-hazard risk framework to stress-test water supply systems to climate-related disruptions. Earth’s Future 11, e2022EF002946. doi:10.1029/2022EF002946</w:t>
             </w:r>
@@ -1225,7 +1225,7 @@
             </w:pPr>
             <w:r>
               <w:rPr>
-                <w:sz w:val="16"/>
+                <w:sz w:val="19"/>
               </w:rPr>
               <w:t xml:space="preserve">Drought, flood, cyclone</w:t>
             </w:r>
@@ -1242,13 +1242,13 @@
             </w:pPr>
             <w:r>
               <w:rPr>
-                <w:sz w:val="16"/>
+                <w:sz w:val="19"/>
               </w:rPr>
               <w:t xml:space="preserve">One metric for all hazards: expected customer disruption days</w:t>
             </w:r>
             <w:r>
               <w:rPr>
-                <w:sz w:val="16"/>
+                <w:sz w:val="19"/>
               </w:rPr>
               <w:t xml:space="preserve"> </w:t>
             </w:r>
@@ -1318,7 +1318,7 @@
             </m:oMath>
             <w:r>
               <w:rPr>
-                <w:sz w:val="16"/>
+                <w:sz w:val="19"/>
               </w:rPr>
               <w:t xml:space="preserve">; ≈5 days per customer per year now, ×2 to ×2.5 by 2100.</w:t>
             </w:r>
@@ -1335,43 +1335,43 @@
             </w:pPr>
             <w:r>
               <w:rPr>
-                <w:sz w:val="16"/>
+                <w:sz w:val="19"/>
               </w:rPr>
               <w:t xml:space="preserve">Replaces the yes/no 250 mg/L goal by expected salinity-disruption days plus a tail guard; can favour a reserve well over one</w:t>
             </w:r>
             <w:r>
               <w:rPr>
-                <w:sz w:val="16"/>
+                <w:sz w:val="19"/>
               </w:rPr>
               <w:t xml:space="preserve"> </w:t>
             </w:r>
             <w:r>
               <w:rPr>
-                <w:sz w:val="16"/>
+                <w:sz w:val="19"/>
               </w:rPr>
               <w:t xml:space="preserve">“</w:t>
             </w:r>
             <w:r>
               <w:rPr>
-                <w:sz w:val="16"/>
+                <w:sz w:val="19"/>
               </w:rPr>
               <w:t xml:space="preserve">safest</w:t>
             </w:r>
             <w:r>
               <w:rPr>
-                <w:sz w:val="16"/>
+                <w:sz w:val="19"/>
               </w:rPr>
               <w:t xml:space="preserve">”</w:t>
             </w:r>
             <w:r>
               <w:rPr>
-                <w:sz w:val="16"/>
+                <w:sz w:val="19"/>
               </w:rPr>
               <w:t xml:space="preserve"> </w:t>
             </w:r>
             <w:r>
               <w:rPr>
-                <w:sz w:val="16"/>
+                <w:sz w:val="19"/>
               </w:rPr>
               <w:t xml:space="preserve">site.</w:t>
             </w:r>
@@ -1388,7 +1388,7 @@
             </w:pPr>
             <w:r>
               <w:rPr>
-                <w:sz w:val="16"/>
+                <w:sz w:val="19"/>
               </w:rPr>
               <w:t xml:space="preserve">Disruption-days goal in MONTIMI-GO placement.</w:t>
             </w:r>
@@ -1407,7 +1407,7 @@
             </w:pPr>
             <w:r>
               <w:rPr>
-                <w:sz w:val="16"/>
+                <w:sz w:val="19"/>
               </w:rPr>
               <w:t xml:space="preserve">5</w:t>
             </w:r>
@@ -1424,7 +1424,7 @@
             </w:pPr>
             <w:r>
               <w:rPr>
-                <w:sz w:val="16"/>
+                <w:sz w:val="19"/>
               </w:rPr>
               <w:t xml:space="preserve">Jesson, Douglas, Manshausen, … Gal, Shalit (2022). Scalable sensitivity and uncertainty analyses for causal-effect estimates of continuous-valued interventions. NeurIPS 35 (no DOI; arXiv:2204.10022)</w:t>
             </w:r>
@@ -1441,7 +1441,7 @@
             </w:pPr>
             <w:r>
               <w:rPr>
-                <w:sz w:val="16"/>
+                <w:sz w:val="19"/>
               </w:rPr>
               <w:t xml:space="preserve">Causal; hidden confounding</w:t>
             </w:r>
@@ -1458,13 +1458,13 @@
             </w:pPr>
             <w:r>
               <w:rPr>
-                <w:sz w:val="16"/>
+                <w:sz w:val="19"/>
               </w:rPr>
               <w:t xml:space="preserve">Bounded hidden confounding for a continuous dose:</w:t>
             </w:r>
             <w:r>
               <w:rPr>
-                <w:sz w:val="16"/>
+                <w:sz w:val="19"/>
               </w:rPr>
               <w:t xml:space="preserve"> </w:t>
             </w:r>
@@ -1570,13 +1570,13 @@
             </m:oMath>
             <w:r>
               <w:rPr>
-                <w:sz w:val="16"/>
+                <w:sz w:val="19"/>
               </w:rPr>
               <w:t xml:space="preserve"> </w:t>
             </w:r>
             <w:r>
               <w:rPr>
-                <w:sz w:val="16"/>
+                <w:sz w:val="19"/>
               </w:rPr>
               <w:t xml:space="preserve">turns the dose–response into an interval.</w:t>
             </w:r>
@@ -1593,13 +1593,13 @@
             </w:pPr>
             <w:r>
               <w:rPr>
-                <w:sz w:val="16"/>
+                <w:sz w:val="19"/>
               </w:rPr>
               <w:t xml:space="preserve">Private abstraction in a drought confounds pumping → chloride; a</w:t>
             </w:r>
             <w:r>
               <w:rPr>
-                <w:sz w:val="16"/>
+                <w:sz w:val="19"/>
               </w:rPr>
               <w:t xml:space="preserve"> </w:t>
             </w:r>
@@ -1610,13 +1610,13 @@
             </m:oMath>
             <w:r>
               <w:rPr>
-                <w:sz w:val="16"/>
+                <w:sz w:val="19"/>
               </w:rPr>
               <w:t xml:space="preserve">-robust margin covers it;</w:t>
             </w:r>
             <w:r>
               <w:rPr>
-                <w:sz w:val="16"/>
+                <w:sz w:val="19"/>
               </w:rPr>
               <w:t xml:space="preserve"> </w:t>
             </w:r>
@@ -1657,43 +1657,43 @@
             </m:oMath>
             <w:r>
               <w:rPr>
-                <w:sz w:val="16"/>
+                <w:sz w:val="19"/>
               </w:rPr>
               <w:t xml:space="preserve"> </w:t>
             </w:r>
             <w:r>
               <w:rPr>
-                <w:sz w:val="16"/>
+                <w:sz w:val="19"/>
               </w:rPr>
               <w:t xml:space="preserve">(the confounding that overturns</w:t>
             </w:r>
             <w:r>
               <w:rPr>
-                <w:sz w:val="16"/>
+                <w:sz w:val="19"/>
               </w:rPr>
               <w:t xml:space="preserve"> </w:t>
             </w:r>
             <w:r>
               <w:rPr>
-                <w:sz w:val="16"/>
+                <w:sz w:val="19"/>
               </w:rPr>
               <w:t xml:space="preserve">“</w:t>
             </w:r>
             <w:r>
               <w:rPr>
-                <w:sz w:val="16"/>
+                <w:sz w:val="19"/>
               </w:rPr>
               <w:t xml:space="preserve">safe</w:t>
             </w:r>
             <w:r>
               <w:rPr>
-                <w:sz w:val="16"/>
+                <w:sz w:val="19"/>
               </w:rPr>
               <w:t xml:space="preserve">”</w:t>
             </w:r>
             <w:r>
               <w:rPr>
-                <w:sz w:val="16"/>
+                <w:sz w:val="19"/>
               </w:rPr>
               <w:t xml:space="preserve">) is the number to give stakeholders.</w:t>
             </w:r>
@@ -1710,13 +1710,13 @@
             </w:pPr>
             <w:r>
               <w:rPr>
-                <w:sz w:val="16"/>
+                <w:sz w:val="19"/>
               </w:rPr>
               <w:t xml:space="preserve">Report</w:t>
             </w:r>
             <w:r>
               <w:rPr>
-                <w:sz w:val="16"/>
+                <w:sz w:val="19"/>
               </w:rPr>
               <w:t xml:space="preserve"> </w:t>
             </w:r>
@@ -1757,13 +1757,13 @@
             </m:oMath>
             <w:r>
               <w:rPr>
-                <w:sz w:val="16"/>
+                <w:sz w:val="19"/>
               </w:rPr>
               <w:t xml:space="preserve"> </w:t>
             </w:r>
             <w:r>
               <w:rPr>
-                <w:sz w:val="16"/>
+                <w:sz w:val="19"/>
               </w:rPr>
               <w:t xml:space="preserve">next to every pumping decision.</w:t>
             </w:r>
@@ -1822,7 +1822,7 @@
             <w:r>
               <w:rPr>
                 <w:b/>
-                <w:sz w:val="16"/>
+                <w:sz w:val="19"/>
               </w:rPr>
               <w:t xml:space="preserve">#</w:t>
             </w:r>
@@ -1841,7 +1841,7 @@
             <w:r>
               <w:rPr>
                 <w:b/>
-                <w:sz w:val="16"/>
+                <w:sz w:val="19"/>
               </w:rPr>
               <w:t xml:space="preserve">Paper</w:t>
             </w:r>
@@ -1860,7 +1860,7 @@
             <w:r>
               <w:rPr>
                 <w:b/>
-                <w:sz w:val="16"/>
+                <w:sz w:val="19"/>
               </w:rPr>
               <w:t xml:space="preserve">Situation</w:t>
             </w:r>
@@ -1879,7 +1879,7 @@
             <w:r>
               <w:rPr>
                 <w:b/>
-                <w:sz w:val="16"/>
+                <w:sz w:val="19"/>
               </w:rPr>
               <w:t xml:space="preserve">Mathematical tool for the decision</w:t>
             </w:r>
@@ -1898,7 +1898,7 @@
             <w:r>
               <w:rPr>
                 <w:b/>
-                <w:sz w:val="16"/>
+                <w:sz w:val="19"/>
               </w:rPr>
               <w:t xml:space="preserve">What it changes in our model</w:t>
             </w:r>
@@ -1917,7 +1917,7 @@
             <w:r>
               <w:rPr>
                 <w:b/>
-                <w:sz w:val="16"/>
+                <w:sz w:val="19"/>
               </w:rPr>
               <w:t xml:space="preserve">Innovation</w:t>
             </w:r>
@@ -1936,7 +1936,7 @@
             </w:pPr>
             <w:r>
               <w:rPr>
-                <w:sz w:val="16"/>
+                <w:sz w:val="19"/>
               </w:rPr>
               <w:t xml:space="preserve">6</w:t>
             </w:r>
@@ -1953,7 +1953,7 @@
             </w:pPr>
             <w:r>
               <w:rPr>
-                <w:sz w:val="16"/>
+                <w:sz w:val="19"/>
               </w:rPr>
               <w:t xml:space="preserve">Yu, Shi, Chung, Yue &amp; Wierman (2020). The power of predictions in online control. NeurIPS 33 (no DOI; arXiv:2006.07569)</w:t>
             </w:r>
@@ -1970,7 +1970,7 @@
             </w:pPr>
             <w:r>
               <w:rPr>
-                <w:sz w:val="16"/>
+                <w:sz w:val="19"/>
               </w:rPr>
               <w:t xml:space="preserve">Normal operation; forecasts</w:t>
             </w:r>
@@ -1987,13 +1987,13 @@
             </w:pPr>
             <w:r>
               <w:rPr>
-                <w:sz w:val="16"/>
+                <w:sz w:val="19"/>
               </w:rPr>
               <w:t xml:space="preserve">Model-predictive control with</w:t>
             </w:r>
             <w:r>
               <w:rPr>
-                <w:sz w:val="16"/>
+                <w:sz w:val="19"/>
               </w:rPr>
               <w:t xml:space="preserve"> </w:t>
             </w:r>
@@ -2004,19 +2004,19 @@
             </m:oMath>
             <w:r>
               <w:rPr>
-                <w:sz w:val="16"/>
+                <w:sz w:val="19"/>
               </w:rPr>
               <w:t xml:space="preserve"> </w:t>
             </w:r>
             <w:r>
               <w:rPr>
-                <w:sz w:val="16"/>
+                <w:sz w:val="19"/>
               </w:rPr>
               <w:t xml:space="preserve">predicted disturbances in a linear-quadratic problem:</w:t>
             </w:r>
             <w:r>
               <w:rPr>
-                <w:sz w:val="16"/>
+                <w:sz w:val="19"/>
               </w:rPr>
               <w:t xml:space="preserve"> </w:t>
             </w:r>
@@ -2046,13 +2046,13 @@
             </m:oMath>
             <w:r>
               <w:rPr>
-                <w:sz w:val="16"/>
+                <w:sz w:val="19"/>
               </w:rPr>
               <w:t xml:space="preserve"> </w:t>
             </w:r>
             <w:r>
               <w:rPr>
-                <w:sz w:val="16"/>
+                <w:sz w:val="19"/>
               </w:rPr>
               <w:t xml:space="preserve">predictions give constant regret, matching the lower bound.</w:t>
             </w:r>
@@ -2069,7 +2069,7 @@
             </w:pPr>
             <w:r>
               <w:rPr>
-                <w:sz w:val="16"/>
+                <w:sz w:val="19"/>
               </w:rPr>
               <w:t xml:space="preserve">How many seasons of recharge forecast a pumping controller needs; the rainfall persistence (lag-one correlation 0.7) gives part of it for free; slow clay memory lengthens it.</w:t>
             </w:r>
@@ -2086,7 +2086,7 @@
             </w:pPr>
             <w:r>
               <w:rPr>
-                <w:sz w:val="16"/>
+                <w:sz w:val="19"/>
               </w:rPr>
               <w:t xml:space="preserve">Forecast-horizon rule for curtailment.</w:t>
             </w:r>
@@ -2105,7 +2105,7 @@
             </w:pPr>
             <w:r>
               <w:rPr>
-                <w:sz w:val="16"/>
+                <w:sz w:val="19"/>
               </w:rPr>
               <w:t xml:space="preserve">7</w:t>
             </w:r>
@@ -2122,7 +2122,7 @@
             </w:pPr>
             <w:r>
               <w:rPr>
-                <w:sz w:val="16"/>
+                <w:sz w:val="19"/>
               </w:rPr>
               <w:t xml:space="preserve">Schneider, Dunbar, Wu, … Shaman (2022). Epidemic management and control through risk-dependent individual contact interventions. PLOS Comput. Biol. 18, e1010171. doi:10.1371/journal.pcbi.1010171</w:t>
             </w:r>
@@ -2139,7 +2139,7 @@
             </w:pPr>
             <w:r>
               <w:rPr>
-                <w:sz w:val="16"/>
+                <w:sz w:val="19"/>
               </w:rPr>
               <w:t xml:space="preserve">Crisis operation</w:t>
             </w:r>
@@ -2156,13 +2156,13 @@
             </w:pPr>
             <w:r>
               <w:rPr>
-                <w:sz w:val="16"/>
+                <w:sz w:val="19"/>
               </w:rPr>
               <w:t xml:space="preserve">Network data assimilation gives each node’s risk; act only where</w:t>
             </w:r>
             <w:r>
               <w:rPr>
-                <w:sz w:val="16"/>
+                <w:sz w:val="19"/>
               </w:rPr>
               <w:t xml:space="preserve"> </w:t>
             </w:r>
@@ -2208,7 +2208,7 @@
             </m:oMath>
             <w:r>
               <w:rPr>
-                <w:sz w:val="16"/>
+                <w:sz w:val="19"/>
               </w:rPr>
               <w:t xml:space="preserve">. Fewer than half the deaths of a lockdown while isolating 5–10%.</w:t>
             </w:r>
@@ -2225,13 +2225,13 @@
             </w:pPr>
             <w:r>
               <w:rPr>
-                <w:sz w:val="16"/>
+                <w:sz w:val="19"/>
               </w:rPr>
               <w:t xml:space="preserve">Curtail well by well when the posterior</w:t>
             </w:r>
             <w:r>
               <w:rPr>
-                <w:sz w:val="16"/>
+                <w:sz w:val="19"/>
               </w:rPr>
               <w:t xml:space="preserve"> </w:t>
             </w:r>
@@ -2300,13 +2300,13 @@
             </m:oMath>
             <w:r>
               <w:rPr>
-                <w:sz w:val="16"/>
+                <w:sz w:val="19"/>
               </w:rPr>
               <w:t xml:space="preserve"> </w:t>
             </w:r>
             <w:r>
               <w:rPr>
-                <w:sz w:val="16"/>
+                <w:sz w:val="19"/>
               </w:rPr>
               <w:t xml:space="preserve">passes a threshold, from sparse samples.</w:t>
             </w:r>
@@ -2323,7 +2323,7 @@
             </w:pPr>
             <w:r>
               <w:rPr>
-                <w:sz w:val="16"/>
+                <w:sz w:val="19"/>
               </w:rPr>
               <w:t xml:space="preserve">Risk-threshold curtailment (used as the decision rule of ROJA-GO).</w:t>
             </w:r>
@@ -2342,7 +2342,7 @@
             </w:pPr>
             <w:r>
               <w:rPr>
-                <w:sz w:val="16"/>
+                <w:sz w:val="19"/>
               </w:rPr>
               <w:t xml:space="preserve">8</w:t>
             </w:r>
@@ -2359,7 +2359,7 @@
             </w:pPr>
             <w:r>
               <w:rPr>
-                <w:sz w:val="16"/>
+                <w:sz w:val="19"/>
               </w:rPr>
               <w:t xml:space="preserve">Kurth, Subramanian, … Kashinath, Anandkumar (2023). FourCastNet: accelerating global high-resolution weather forecasting using adaptive Fourier neural operators. PASC ’23. doi:10.1145/3592979.3593412</w:t>
             </w:r>
@@ -2376,7 +2376,7 @@
             </w:pPr>
             <w:r>
               <w:rPr>
-                <w:sz w:val="16"/>
+                <w:sz w:val="19"/>
               </w:rPr>
               <w:t xml:space="preserve">Intense rainfall</w:t>
             </w:r>
@@ -2393,7 +2393,7 @@
             </w:pPr>
             <w:r>
               <w:rPr>
-                <w:sz w:val="16"/>
+                <w:sz w:val="19"/>
               </w:rPr>
               <w:t xml:space="preserve">Neural-operator weather emulator, orders of magnitude faster than numerical weather prediction, so ensembles large enough to sample rare extremes.</w:t>
             </w:r>
@@ -2410,7 +2410,7 @@
             </w:pPr>
             <w:r>
               <w:rPr>
-                <w:sz w:val="16"/>
+                <w:sz w:val="19"/>
               </w:rPr>
               <w:t xml:space="preserve">Rainfall tails at the gauge and rain-plus-surge storylines for the alarm margin; it forecasts days to weeks, so it says nothing on multi-year drought.</w:t>
             </w:r>
@@ -2427,7 +2427,7 @@
             </w:pPr>
             <w:r>
               <w:rPr>
-                <w:sz w:val="16"/>
+                <w:sz w:val="19"/>
               </w:rPr>
               <w:t xml:space="preserve">Emulator ensemble of intense-rain storylines.</w:t>
             </w:r>
@@ -2446,7 +2446,7 @@
             </w:pPr>
             <w:r>
               <w:rPr>
-                <w:sz w:val="16"/>
+                <w:sz w:val="19"/>
               </w:rPr>
               <w:t xml:space="preserve">9</w:t>
             </w:r>
@@ -2463,7 +2463,7 @@
             </w:pPr>
             <w:r>
               <w:rPr>
-                <w:sz w:val="16"/>
+                <w:sz w:val="19"/>
               </w:rPr>
               <w:t xml:space="preserve">Humphrey, Berg, Ciais, … Frankenberg (2021). Soil moisture–atmosphere feedback dominates land carbon uptake variability. Nature 592, 65–69. doi:10.1038/s41586-021-03325-5</w:t>
             </w:r>
@@ -2480,7 +2480,7 @@
             </w:pPr>
             <w:r>
               <w:rPr>
-                <w:sz w:val="16"/>
+                <w:sz w:val="19"/>
               </w:rPr>
               <w:t xml:space="preserve">Drought; causal (feedback)</w:t>
             </w:r>
@@ -2497,7 +2497,7 @@
             </w:pPr>
             <w:r>
               <w:rPr>
-                <w:sz w:val="16"/>
+                <w:sz w:val="19"/>
               </w:rPr>
               <w:t xml:space="preserve">Factorial runs with soil moisture held at climatology separate the direct effect from the feedback effect; ≈90% of year-to-year uptake variation goes through soil moisture.</w:t>
             </w:r>
@@ -2514,13 +2514,13 @@
             </w:pPr>
             <w:r>
               <w:rPr>
-                <w:sz w:val="16"/>
+                <w:sz w:val="19"/>
               </w:rPr>
               <w:t xml:space="preserve">A</w:t>
             </w:r>
             <w:r>
               <w:rPr>
-                <w:sz w:val="16"/>
+                <w:sz w:val="19"/>
               </w:rPr>
               <w:t xml:space="preserve"> </w:t>
             </w:r>
@@ -2540,13 +2540,13 @@
             </m:oMath>
             <w:r>
               <w:rPr>
-                <w:sz w:val="16"/>
+                <w:sz w:val="19"/>
               </w:rPr>
               <w:t xml:space="preserve"> </w:t>
             </w:r>
             <w:r>
               <w:rPr>
-                <w:sz w:val="16"/>
+                <w:sz w:val="19"/>
               </w:rPr>
               <w:t xml:space="preserve">factorial of MONTIMI-GO separates the direct recharge effect of a drought from the human feedback (private abstraction); the anchor certificate does not cover a changed feedback.</w:t>
             </w:r>
@@ -2563,43 +2563,43 @@
             </w:pPr>
             <w:r>
               <w:rPr>
-                <w:sz w:val="16"/>
+                <w:sz w:val="19"/>
               </w:rPr>
               <w:t xml:space="preserve">The</w:t>
             </w:r>
             <w:r>
               <w:rPr>
-                <w:sz w:val="16"/>
+                <w:sz w:val="19"/>
               </w:rPr>
               <w:t xml:space="preserve"> </w:t>
             </w:r>
             <w:r>
               <w:rPr>
-                <w:sz w:val="16"/>
+                <w:sz w:val="19"/>
               </w:rPr>
               <w:t xml:space="preserve">“</w:t>
             </w:r>
             <w:r>
               <w:rPr>
-                <w:sz w:val="16"/>
+                <w:sz w:val="19"/>
               </w:rPr>
               <w:t xml:space="preserve">causal</w:t>
             </w:r>
             <w:r>
               <w:rPr>
-                <w:sz w:val="16"/>
+                <w:sz w:val="19"/>
               </w:rPr>
               <w:t xml:space="preserve">”</w:t>
             </w:r>
             <w:r>
               <w:rPr>
-                <w:sz w:val="16"/>
+                <w:sz w:val="19"/>
               </w:rPr>
               <w:t xml:space="preserve"> </w:t>
             </w:r>
             <w:r>
               <w:rPr>
-                <w:sz w:val="16"/>
+                <w:sz w:val="19"/>
               </w:rPr>
               <w:t xml:space="preserve">storyline of the test below.</w:t>
             </w:r>
@@ -2618,7 +2618,7 @@
             </w:pPr>
             <w:r>
               <w:rPr>
-                <w:sz w:val="16"/>
+                <w:sz w:val="19"/>
               </w:rPr>
               <w:t xml:space="preserve">10</w:t>
             </w:r>
@@ -2635,7 +2635,7 @@
             </w:pPr>
             <w:r>
               <w:rPr>
-                <w:sz w:val="16"/>
+                <w:sz w:val="19"/>
               </w:rPr>
               <w:t xml:space="preserve">Frederikse, Landerer, Caron, … Humphrey, … Wu (2020). The causes of sea-level rise since 1900. Nature 584, 393–397. doi:10.1038/s41586-020-2591-3</w:t>
             </w:r>
@@ -2652,7 +2652,7 @@
             </w:pPr>
             <w:r>
               <w:rPr>
-                <w:sz w:val="16"/>
+                <w:sz w:val="19"/>
               </w:rPr>
               <w:t xml:space="preserve">Sea boundary; causal budget</w:t>
             </w:r>
@@ -2669,7 +2669,7 @@
             </w:pPr>
             <w:r>
               <w:rPr>
-                <w:sz w:val="16"/>
+                <w:sz w:val="19"/>
               </w:rPr>
               <w:t xml:space="preserve">Closed sea-level budget attributing the rise to named causes (glaciers and ice sheets twice thermal expansion).</w:t>
             </w:r>
@@ -2686,7 +2686,7 @@
             </w:pPr>
             <w:r>
               <w:rPr>
-                <w:sz w:val="16"/>
+                <w:sz w:val="19"/>
               </w:rPr>
               <w:t xml:space="preserve">Build the sea-boundary head from components plus land motion and surge; the adjoint ranks which one matters for chloride at the screen.</w:t>
             </w:r>
@@ -2703,7 +2703,7 @@
             </w:pPr>
             <w:r>
               <w:rPr>
-                <w:sz w:val="16"/>
+                <w:sz w:val="19"/>
               </w:rPr>
               <w:t xml:space="preserve">Component-wise sea boundary with adjoint ranking.</w:t>
             </w:r>
@@ -2762,7 +2762,7 @@
             <w:r>
               <w:rPr>
                 <w:b/>
-                <w:sz w:val="16"/>
+                <w:sz w:val="19"/>
               </w:rPr>
               <w:t xml:space="preserve">#</w:t>
             </w:r>
@@ -2781,7 +2781,7 @@
             <w:r>
               <w:rPr>
                 <w:b/>
-                <w:sz w:val="16"/>
+                <w:sz w:val="19"/>
               </w:rPr>
               <w:t xml:space="preserve">Paper</w:t>
             </w:r>
@@ -2800,7 +2800,7 @@
             <w:r>
               <w:rPr>
                 <w:b/>
-                <w:sz w:val="16"/>
+                <w:sz w:val="19"/>
               </w:rPr>
               <w:t xml:space="preserve">Situation</w:t>
             </w:r>
@@ -2819,7 +2819,7 @@
             <w:r>
               <w:rPr>
                 <w:b/>
-                <w:sz w:val="16"/>
+                <w:sz w:val="19"/>
               </w:rPr>
               <w:t xml:space="preserve">Mathematical tool for the decision</w:t>
             </w:r>
@@ -2838,7 +2838,7 @@
             <w:r>
               <w:rPr>
                 <w:b/>
-                <w:sz w:val="16"/>
+                <w:sz w:val="19"/>
               </w:rPr>
               <w:t xml:space="preserve">What it changes in our model</w:t>
             </w:r>
@@ -2857,7 +2857,7 @@
             <w:r>
               <w:rPr>
                 <w:b/>
-                <w:sz w:val="16"/>
+                <w:sz w:val="19"/>
               </w:rPr>
               <w:t xml:space="preserve">Innovation</w:t>
             </w:r>
@@ -2876,7 +2876,7 @@
             </w:pPr>
             <w:r>
               <w:rPr>
-                <w:sz w:val="16"/>
+                <w:sz w:val="19"/>
               </w:rPr>
               <w:t xml:space="preserve">11</w:t>
             </w:r>
@@ -2893,7 +2893,7 @@
             </w:pPr>
             <w:r>
               <w:rPr>
-                <w:sz w:val="16"/>
+                <w:sz w:val="19"/>
               </w:rPr>
               <w:t xml:space="preserve">Considine, Nethery, Wellenius, Dominici &amp; Tec (2025). Optimizing heat alert issuance with reinforcement learning. AAAI-25 39(27). doi:10.1609/aaai.v39i27.35009</w:t>
             </w:r>
@@ -2910,7 +2910,7 @@
             </w:pPr>
             <w:r>
               <w:rPr>
-                <w:sz w:val="16"/>
+                <w:sz w:val="19"/>
               </w:rPr>
               <w:t xml:space="preserve">Extreme heat; alerts</w:t>
             </w:r>
@@ -2927,7 +2927,7 @@
             </w:pPr>
             <w:r>
               <w:rPr>
-                <w:sz w:val="16"/>
+                <w:sz w:val="19"/>
               </w:rPr>
               <w:t xml:space="preserve">Reinforcement learning of when to issue alerts under an alert budget; beats the National Weather Service policy in 30 counties.</w:t>
             </w:r>
@@ -2944,7 +2944,7 @@
             </w:pPr>
             <w:r>
               <w:rPr>
-                <w:sz w:val="16"/>
+                <w:sz w:val="19"/>
               </w:rPr>
               <w:t xml:space="preserve">A budgeted alarm: the number of curtailments or extra samples per year is capped, and spent where they save most.</w:t>
             </w:r>
@@ -2961,7 +2961,7 @@
             </w:pPr>
             <w:r>
               <w:rPr>
-                <w:sz w:val="16"/>
+                <w:sz w:val="19"/>
               </w:rPr>
               <w:t xml:space="preserve">Sample budget of ROJA-GO (≤ one extra sample a year).</w:t>
             </w:r>
@@ -2980,7 +2980,7 @@
             </w:pPr>
             <w:r>
               <w:rPr>
-                <w:sz w:val="16"/>
+                <w:sz w:val="19"/>
               </w:rPr>
               <w:t xml:space="preserve">12</w:t>
             </w:r>
@@ -2997,7 +2997,7 @@
             </w:pPr>
             <w:r>
               <w:rPr>
-                <w:sz w:val="16"/>
+                <w:sz w:val="19"/>
               </w:rPr>
               <w:t xml:space="preserve">Xu, Perrault, Fang, Chen &amp; Tambe (2021). Robust reinforcement learning under minimax regret for green security. UAI 2021, PMLR 161:257–267 (no DOI)</w:t>
             </w:r>
@@ -3014,7 +3014,7 @@
             </w:pPr>
             <w:r>
               <w:rPr>
-                <w:sz w:val="16"/>
+                <w:sz w:val="19"/>
               </w:rPr>
               <w:t xml:space="preserve">Decision under uncertainty</w:t>
             </w:r>
@@ -3031,13 +3031,13 @@
             </w:pPr>
             <w:r>
               <w:rPr>
-                <w:sz w:val="16"/>
+                <w:sz w:val="19"/>
               </w:rPr>
               <w:t xml:space="preserve">Minimax-regret policy,</w:t>
             </w:r>
             <w:r>
               <w:rPr>
-                <w:sz w:val="16"/>
+                <w:sz w:val="19"/>
               </w:rPr>
               <w:t xml:space="preserve"> </w:t>
             </w:r>
@@ -3162,7 +3162,7 @@
             </m:oMath>
             <w:r>
               <w:rPr>
-                <w:sz w:val="16"/>
+                <w:sz w:val="19"/>
               </w:rPr>
               <w:t xml:space="preserve">, solved as a game against nature (MIRROR).</w:t>
             </w:r>
@@ -3179,7 +3179,7 @@
             </w:pPr>
             <w:r>
               <w:rPr>
-                <w:sz w:val="16"/>
+                <w:sz w:val="19"/>
               </w:rPr>
               <w:t xml:space="preserve">Minimax-regret well placement over recharge, private abstraction and sea level, with the MONTIMI-GO adjoint searching the worst case.</w:t>
             </w:r>
@@ -3196,7 +3196,7 @@
             </w:pPr>
             <w:r>
               <w:rPr>
-                <w:sz w:val="16"/>
+                <w:sz w:val="19"/>
               </w:rPr>
               <w:t xml:space="preserve">Regret-robust siting.</w:t>
             </w:r>
@@ -3215,7 +3215,7 @@
             </w:pPr>
             <w:r>
               <w:rPr>
-                <w:sz w:val="16"/>
+                <w:sz w:val="19"/>
               </w:rPr>
               <w:t xml:space="preserve">13</w:t>
             </w:r>
@@ -3232,7 +3232,7 @@
             </w:pPr>
             <w:r>
               <w:rPr>
-                <w:sz w:val="16"/>
+                <w:sz w:val="19"/>
               </w:rPr>
               <w:t xml:space="preserve">Wu, Weinberger, Wellenius, Dominici &amp; Braun (2024). Assessing the causal effects of a stochastic intervention in time series data: are heat alerts effective in preventing deaths and hospitalizations? Biostatistics 25, 57–79. doi:10.1093/biostatistics/kxad002</w:t>
             </w:r>
@@ -3249,7 +3249,7 @@
             </w:pPr>
             <w:r>
               <w:rPr>
-                <w:sz w:val="16"/>
+                <w:sz w:val="19"/>
               </w:rPr>
               <w:t xml:space="preserve">Causal; heat alerts</w:t>
             </w:r>
@@ -3266,13 +3266,13 @@
             </w:pPr>
             <w:r>
               <w:rPr>
-                <w:sz w:val="16"/>
+                <w:sz w:val="19"/>
               </w:rPr>
               <w:t xml:space="preserve">Incremental intervention: multiply the odds of an alert by</w:t>
             </w:r>
             <w:r>
               <w:rPr>
-                <w:sz w:val="16"/>
+                <w:sz w:val="19"/>
               </w:rPr>
               <w:t xml:space="preserve"> </w:t>
             </w:r>
@@ -3283,7 +3283,7 @@
             </m:oMath>
             <w:r>
               <w:rPr>
-                <w:sz w:val="16"/>
+                <w:sz w:val="19"/>
               </w:rPr>
               <w:t xml:space="preserve">; identified under weaker overlap. Evidence of benefit is weak.</w:t>
             </w:r>
@@ -3300,7 +3300,7 @@
             </w:pPr>
             <w:r>
               <w:rPr>
-                <w:sz w:val="16"/>
+                <w:sz w:val="19"/>
               </w:rPr>
               <w:t xml:space="preserve">Pumping depends on the drought state, so the pumping anchor is not exogenous; a decision is a shift of the pumping odds.</w:t>
             </w:r>
@@ -3317,13 +3317,13 @@
             </w:pPr>
             <w:r>
               <w:rPr>
-                <w:sz w:val="16"/>
+                <w:sz w:val="19"/>
               </w:rPr>
               <w:t xml:space="preserve">Largest certifiable</w:t>
             </w:r>
             <w:r>
               <w:rPr>
-                <w:sz w:val="16"/>
+                <w:sz w:val="19"/>
               </w:rPr>
               <w:t xml:space="preserve"> </w:t>
             </w:r>
@@ -3334,13 +3334,13 @@
             </m:oMath>
             <w:r>
               <w:rPr>
-                <w:sz w:val="16"/>
+                <w:sz w:val="19"/>
               </w:rPr>
               <w:t xml:space="preserve"> </w:t>
             </w:r>
             <w:r>
               <w:rPr>
-                <w:sz w:val="16"/>
+                <w:sz w:val="19"/>
               </w:rPr>
               <w:t xml:space="preserve">before an early chloride sample is needed.</w:t>
             </w:r>
@@ -3359,7 +3359,7 @@
             </w:pPr>
             <w:r>
               <w:rPr>
-                <w:sz w:val="16"/>
+                <w:sz w:val="19"/>
               </w:rPr>
               <w:t xml:space="preserve">14</w:t>
             </w:r>
@@ -3376,7 +3376,7 @@
             </w:pPr>
             <w:r>
               <w:rPr>
-                <w:sz w:val="16"/>
+                <w:sz w:val="19"/>
               </w:rPr>
               <w:t xml:space="preserve">Nethery, Katz-Christy, Kioumourtzoglou, Parks, Schumacher &amp; Anderson (2023). Integrated causal-predictive machine learning models for tropical cyclone epidemiology. Biostatistics 24, 449–464. doi:10.1093/biostatistics/kxab047</w:t>
             </w:r>
@@ -3393,7 +3393,7 @@
             </w:pPr>
             <w:r>
               <w:rPr>
-                <w:sz w:val="16"/>
+                <w:sz w:val="19"/>
               </w:rPr>
               <w:t xml:space="preserve">Storms; causal</w:t>
             </w:r>
@@ -3410,7 +3410,7 @@
             </w:pPr>
             <w:r>
               <w:rPr>
-                <w:sz w:val="16"/>
+                <w:sz w:val="19"/>
               </w:rPr>
               <w:t xml:space="preserve">Stage 1 estimates the causal effect of each storm at each place; stage 2 predicts these effects from storm and place traits.</w:t>
             </w:r>
@@ -3427,7 +3427,7 @@
             </w:pPr>
             <w:r>
               <w:rPr>
-                <w:sz w:val="16"/>
+                <w:sz w:val="19"/>
               </w:rPr>
               <w:t xml:space="preserve">A per-well storm/flood vulnerability, learned from simulator runs where the true effect is known.</w:t>
             </w:r>
@@ -3444,7 +3444,7 @@
             </w:pPr>
             <w:r>
               <w:rPr>
-                <w:sz w:val="16"/>
+                <w:sz w:val="19"/>
               </w:rPr>
               <w:t xml:space="preserve">Two-stage vulnerability map of wells.</w:t>
             </w:r>
@@ -3463,7 +3463,7 @@
             </w:pPr>
             <w:r>
               <w:rPr>
-                <w:sz w:val="16"/>
+                <w:sz w:val="19"/>
               </w:rPr>
               <w:t xml:space="preserve">15</w:t>
             </w:r>
@@ -3480,7 +3480,7 @@
             </w:pPr>
             <w:r>
               <w:rPr>
-                <w:sz w:val="16"/>
+                <w:sz w:val="19"/>
               </w:rPr>
               <w:t xml:space="preserve">Proctor, Rigden, Chan &amp; Huybers (2022). More accurate specification of water supply shows its importance for global crop production. Nature Food 3, 753–763. doi:10.1038/s43016-022-00592-x</w:t>
             </w:r>
@@ -3497,7 +3497,7 @@
             </w:pPr>
             <w:r>
               <w:rPr>
-                <w:sz w:val="16"/>
+                <w:sz w:val="19"/>
               </w:rPr>
               <w:t xml:space="preserve">Drought; proxy error</w:t>
             </w:r>
@@ -3514,7 +3514,7 @@
             </w:pPr>
             <w:r>
               <w:rPr>
-                <w:sz w:val="16"/>
+                <w:sz w:val="19"/>
               </w:rPr>
               <w:t xml:space="preserve">Soil moisture explains 30–120% more yield variation than precipitation; temperature-plus-precipitation models overstate damages by 28–320%.</w:t>
             </w:r>
@@ -3531,43 +3531,43 @@
             </w:pPr>
             <w:r>
               <w:rPr>
-                <w:sz w:val="16"/>
+                <w:sz w:val="19"/>
               </w:rPr>
               <w:t xml:space="preserve">Rainfall is a poor proxy of the water that reaches the ground: in intense rain most of it runs off, so the gauge anchor breaks. This is the</w:t>
             </w:r>
             <w:r>
               <w:rPr>
-                <w:sz w:val="16"/>
+                <w:sz w:val="19"/>
               </w:rPr>
               <w:t xml:space="preserve"> </w:t>
             </w:r>
             <w:r>
               <w:rPr>
-                <w:sz w:val="16"/>
+                <w:sz w:val="19"/>
               </w:rPr>
               <w:t xml:space="preserve">“</w:t>
             </w:r>
             <w:r>
               <w:rPr>
-                <w:sz w:val="16"/>
+                <w:sz w:val="19"/>
               </w:rPr>
               <w:t xml:space="preserve">intense rainfall</w:t>
             </w:r>
             <w:r>
               <w:rPr>
-                <w:sz w:val="16"/>
+                <w:sz w:val="19"/>
               </w:rPr>
               <w:t xml:space="preserve">”</w:t>
             </w:r>
             <w:r>
               <w:rPr>
-                <w:sz w:val="16"/>
+                <w:sz w:val="19"/>
               </w:rPr>
               <w:t xml:space="preserve"> </w:t>
             </w:r>
             <w:r>
               <w:rPr>
-                <w:sz w:val="16"/>
+                <w:sz w:val="19"/>
               </w:rPr>
               <w:t xml:space="preserve">storyline below.</w:t>
             </w:r>
@@ -3584,7 +3584,7 @@
             </w:pPr>
             <w:r>
               <w:rPr>
-                <w:sz w:val="16"/>
+                <w:sz w:val="19"/>
               </w:rPr>
               <w:t xml:space="preserve">Anchor-adequacy test (gauge vs soil moisture).</w:t>
             </w:r>
@@ -3643,7 +3643,7 @@
             <w:r>
               <w:rPr>
                 <w:b/>
-                <w:sz w:val="16"/>
+                <w:sz w:val="19"/>
               </w:rPr>
               <w:t xml:space="preserve">#</w:t>
             </w:r>
@@ -3662,7 +3662,7 @@
             <w:r>
               <w:rPr>
                 <w:b/>
-                <w:sz w:val="16"/>
+                <w:sz w:val="19"/>
               </w:rPr>
               <w:t xml:space="preserve">Paper</w:t>
             </w:r>
@@ -3681,7 +3681,7 @@
             <w:r>
               <w:rPr>
                 <w:b/>
-                <w:sz w:val="16"/>
+                <w:sz w:val="19"/>
               </w:rPr>
               <w:t xml:space="preserve">Situation</w:t>
             </w:r>
@@ -3700,7 +3700,7 @@
             <w:r>
               <w:rPr>
                 <w:b/>
-                <w:sz w:val="16"/>
+                <w:sz w:val="19"/>
               </w:rPr>
               <w:t xml:space="preserve">Mathematical tool for the decision</w:t>
             </w:r>
@@ -3719,7 +3719,7 @@
             <w:r>
               <w:rPr>
                 <w:b/>
-                <w:sz w:val="16"/>
+                <w:sz w:val="19"/>
               </w:rPr>
               <w:t xml:space="preserve">What it changes in our model</w:t>
             </w:r>
@@ -3738,7 +3738,7 @@
             <w:r>
               <w:rPr>
                 <w:b/>
-                <w:sz w:val="16"/>
+                <w:sz w:val="19"/>
               </w:rPr>
               <w:t xml:space="preserve">Innovation</w:t>
             </w:r>
@@ -3757,7 +3757,7 @@
             </w:pPr>
             <w:r>
               <w:rPr>
-                <w:sz w:val="16"/>
+                <w:sz w:val="19"/>
               </w:rPr>
               <w:t xml:space="preserve">16</w:t>
             </w:r>
@@ -3774,7 +3774,7 @@
             </w:pPr>
             <w:r>
               <w:rPr>
-                <w:sz w:val="16"/>
+                <w:sz w:val="19"/>
               </w:rPr>
               <w:t xml:space="preserve">Bertsimas &amp; Kallus (2020). From predictive to prescriptive analytics. Management Science 66, 1025–1044. doi:10.1287/mnsc.2018.3253</w:t>
             </w:r>
@@ -3791,7 +3791,7 @@
             </w:pPr>
             <w:r>
               <w:rPr>
-                <w:sz w:val="16"/>
+                <w:sz w:val="19"/>
               </w:rPr>
               <w:t xml:space="preserve">Normal operation</w:t>
             </w:r>
@@ -3808,13 +3808,13 @@
             </w:pPr>
             <w:r>
               <w:rPr>
-                <w:sz w:val="16"/>
+                <w:sz w:val="19"/>
               </w:rPr>
               <w:t xml:space="preserve">Decision from data:</w:t>
             </w:r>
             <w:r>
               <w:rPr>
-                <w:sz w:val="16"/>
+                <w:sz w:val="19"/>
               </w:rPr>
               <w:t xml:space="preserve"> </w:t>
             </w:r>
@@ -3954,13 +3954,13 @@
             </m:oMath>
             <w:r>
               <w:rPr>
-                <w:sz w:val="16"/>
+                <w:sz w:val="19"/>
               </w:rPr>
               <w:t xml:space="preserve"> </w:t>
             </w:r>
             <w:r>
               <w:rPr>
-                <w:sz w:val="16"/>
+                <w:sz w:val="19"/>
               </w:rPr>
               <w:t xml:space="preserve">with weights from kNN, trees or forests, scored by a coefficient of prescriptiveness.</w:t>
             </w:r>
@@ -3977,7 +3977,7 @@
             </w:pPr>
             <w:r>
               <w:rPr>
-                <w:sz w:val="16"/>
+                <w:sz w:val="19"/>
               </w:rPr>
               <w:t xml:space="preserve">Pumping chosen from the covariates the utility has (last season’s rainfall, heads); cut after a dry year.</w:t>
             </w:r>
@@ -3994,7 +3994,7 @@
             </w:pPr>
             <w:r>
               <w:rPr>
-                <w:sz w:val="16"/>
+                <w:sz w:val="19"/>
               </w:rPr>
               <w:t xml:space="preserve">Prescriptiveness as the value of a monitoring well.</w:t>
             </w:r>
@@ -4013,7 +4013,7 @@
             </w:pPr>
             <w:r>
               <w:rPr>
-                <w:sz w:val="16"/>
+                <w:sz w:val="19"/>
               </w:rPr>
               <w:t xml:space="preserve">17</w:t>
             </w:r>
@@ -4030,7 +4030,7 @@
             </w:pPr>
             <w:r>
               <w:rPr>
-                <w:sz w:val="16"/>
+                <w:sz w:val="19"/>
               </w:rPr>
               <w:t xml:space="preserve">Barthel Sorensen, Charalampopoulos, Zhang, Harrop, Leung &amp; Sapsis (2024). A non-intrusive machine learning framework for debiasing long-time coarse resolution climate simulations and quantifying rare events statistics. JAMES 16, e2023MS004122. doi:10.1029/2023MS004122</w:t>
             </w:r>
@@ -4047,7 +4047,7 @@
             </w:pPr>
             <w:r>
               <w:rPr>
-                <w:sz w:val="16"/>
+                <w:sz w:val="19"/>
               </w:rPr>
               <w:t xml:space="preserve">Extremes</w:t>
             </w:r>
@@ -4064,7 +4064,7 @@
             </w:pPr>
             <w:r>
               <w:rPr>
-                <w:sz w:val="16"/>
+                <w:sz w:val="19"/>
               </w:rPr>
               <w:t xml:space="preserve">Neural correction operator trained on a short nudged run; return periods two orders of magnitude beyond the training data; 8 years of training gave 30-year statistics close to ERA5.</w:t>
             </w:r>
@@ -4081,7 +4081,7 @@
             </w:pPr>
             <w:r>
               <w:rPr>
-                <w:sz w:val="16"/>
+                <w:sz w:val="19"/>
               </w:rPr>
               <w:t xml:space="preserve">Debiased long runs of the recharge drivers give the return period of an exceedance at the screen.</w:t>
             </w:r>
@@ -4098,7 +4098,7 @@
             </w:pPr>
             <w:r>
               <w:rPr>
-                <w:sz w:val="16"/>
+                <w:sz w:val="19"/>
               </w:rPr>
               <w:t xml:space="preserve">Exceedance return periods for the supply well.</w:t>
             </w:r>
@@ -4117,7 +4117,7 @@
             </w:pPr>
             <w:r>
               <w:rPr>
-                <w:sz w:val="16"/>
+                <w:sz w:val="19"/>
               </w:rPr>
               <w:t xml:space="preserve">18</w:t>
             </w:r>
@@ -4134,7 +4134,7 @@
             </w:pPr>
             <w:r>
               <w:rPr>
-                <w:sz w:val="16"/>
+                <w:sz w:val="19"/>
               </w:rPr>
               <w:t xml:space="preserve">Schlosser, Sokolov, Strzepek, Thomas, Gao &amp; Arndt (2021). The changing nature of hydroclimatic risks across South Africa. Climatic Change 168, 28. doi:10.1007/s10584-021-03235-5</w:t>
             </w:r>
@@ -4151,7 +4151,7 @@
             </w:pPr>
             <w:r>
               <w:rPr>
-                <w:sz w:val="16"/>
+                <w:sz w:val="19"/>
               </w:rPr>
               <w:t xml:space="preserve">Drought</w:t>
             </w:r>
@@ -4168,7 +4168,7 @@
             </w:pPr>
             <w:r>
               <w:rPr>
-                <w:sz w:val="16"/>
+                <w:sz w:val="19"/>
               </w:rPr>
               <w:t xml:space="preserve">7,200-member hybrid ensembles (global Monte Carlo × regional patterns); drying risk 3–4× the wetting risk in western and central South Africa.</w:t>
             </w:r>
@@ -4185,7 +4185,7 @@
             </w:pPr>
             <w:r>
               <w:rPr>
-                <w:sz w:val="16"/>
+                <w:sz w:val="19"/>
               </w:rPr>
               <w:t xml:space="preserve">A drifting, skewed recharge: the margin should be asymmetric, larger on the drought side.</w:t>
             </w:r>
@@ -4202,7 +4202,7 @@
             </w:pPr>
             <w:r>
               <w:rPr>
-                <w:sz w:val="16"/>
+                <w:sz w:val="19"/>
               </w:rPr>
               <w:t xml:space="preserve">Drought-side margin.</w:t>
             </w:r>
@@ -4221,7 +4221,7 @@
             </w:pPr>
             <w:r>
               <w:rPr>
-                <w:sz w:val="16"/>
+                <w:sz w:val="19"/>
               </w:rPr>
               <w:t xml:space="preserve">19</w:t>
             </w:r>
@@ -4238,7 +4238,7 @@
             </w:pPr>
             <w:r>
               <w:rPr>
-                <w:sz w:val="16"/>
+                <w:sz w:val="19"/>
               </w:rPr>
               <w:t xml:space="preserve">Abadie (2021). Using synthetic controls: feasibility, data requirements, and methodological aspects. J. Econ. Lit. 59, 391–425. doi:10.1257/jel.20191450</w:t>
             </w:r>
@@ -4255,7 +4255,7 @@
             </w:pPr>
             <w:r>
               <w:rPr>
-                <w:sz w:val="16"/>
+                <w:sz w:val="19"/>
               </w:rPr>
               <w:t xml:space="preserve">Causal</w:t>
             </w:r>
@@ -4272,13 +4272,13 @@
             </w:pPr>
             <w:r>
               <w:rPr>
-                <w:sz w:val="16"/>
+                <w:sz w:val="19"/>
               </w:rPr>
               <w:t xml:space="preserve">Synthetic control: weights</w:t>
             </w:r>
             <w:r>
               <w:rPr>
-                <w:sz w:val="16"/>
+                <w:sz w:val="19"/>
               </w:rPr>
               <w:t xml:space="preserve"> </w:t>
             </w:r>
@@ -4343,19 +4343,19 @@
             </m:oMath>
             <w:r>
               <w:rPr>
-                <w:sz w:val="16"/>
+                <w:sz w:val="19"/>
               </w:rPr>
               <w:t xml:space="preserve"> </w:t>
             </w:r>
             <w:r>
               <w:rPr>
-                <w:sz w:val="16"/>
+                <w:sz w:val="19"/>
               </w:rPr>
               <w:t xml:space="preserve">match the pre-change path; the counterfactual is</w:t>
             </w:r>
             <w:r>
               <w:rPr>
-                <w:sz w:val="16"/>
+                <w:sz w:val="19"/>
               </w:rPr>
               <w:t xml:space="preserve"> </w:t>
             </w:r>
@@ -4410,7 +4410,7 @@
             </m:oMath>
             <w:r>
               <w:rPr>
-                <w:sz w:val="16"/>
+                <w:sz w:val="19"/>
               </w:rPr>
               <w:t xml:space="preserve">.</w:t>
             </w:r>
@@ -4427,7 +4427,7 @@
             </w:pPr>
             <w:r>
               <w:rPr>
-                <w:sz w:val="16"/>
+                <w:sz w:val="19"/>
               </w:rPr>
               <w:t xml:space="preserve">Counterfactual chloride path after the pumping change, from donor wells outside the cone of depression.</w:t>
             </w:r>
@@ -4444,7 +4444,7 @@
             </w:pPr>
             <w:r>
               <w:rPr>
-                <w:sz w:val="16"/>
+                <w:sz w:val="19"/>
               </w:rPr>
               <w:t xml:space="preserve">Synthetic-control check of the decision effect.</w:t>
             </w:r>
@@ -4463,7 +4463,7 @@
             </w:pPr>
             <w:r>
               <w:rPr>
-                <w:sz w:val="16"/>
+                <w:sz w:val="19"/>
               </w:rPr>
               <w:t xml:space="preserve">20</w:t>
             </w:r>
@@ -4480,7 +4480,7 @@
             </w:pPr>
             <w:r>
               <w:rPr>
-                <w:sz w:val="16"/>
+                <w:sz w:val="19"/>
               </w:rPr>
               <w:t xml:space="preserve">Chernozhukov, Wüthrich &amp; Zhu (2021). An exact and robust conformal inference method for counterfactual and synthetic controls. JASA 116, 1849–1864. doi:10.1080/01621459.2021.1920957</w:t>
             </w:r>
@@ -4497,7 +4497,7 @@
             </w:pPr>
             <w:r>
               <w:rPr>
-                <w:sz w:val="16"/>
+                <w:sz w:val="19"/>
               </w:rPr>
               <w:t xml:space="preserve">Causal; break detection</w:t>
             </w:r>
@@ -4514,7 +4514,7 @@
             </w:pPr>
             <w:r>
               <w:rPr>
-                <w:sz w:val="16"/>
+                <w:sz w:val="19"/>
               </w:rPr>
               <w:t xml:space="preserve">Permutation (conformal) tests for counterfactuals; exact under exchangeable residuals, approximately valid under dependence.</w:t>
             </w:r>
@@ -4531,7 +4531,7 @@
             </w:pPr>
             <w:r>
               <w:rPr>
-                <w:sz w:val="16"/>
+                <w:sz w:val="19"/>
               </w:rPr>
               <w:t xml:space="preserve">A test for a regime break triggers re-anchoring when needed, not only once a year.</w:t>
             </w:r>
@@ -4548,7 +4548,7 @@
             </w:pPr>
             <w:r>
               <w:rPr>
-                <w:sz w:val="16"/>
+                <w:sz w:val="19"/>
               </w:rPr>
               <w:t xml:space="preserve">The trigger of ROJA-GO.</w:t>
             </w:r>
@@ -4606,7 +4606,7 @@
             <w:r>
               <w:rPr>
                 <w:b/>
-                <w:sz w:val="17"/>
+                <w:sz w:val="20"/>
               </w:rPr>
               <w:t xml:space="preserve">Situation</w:t>
             </w:r>
@@ -4625,7 +4625,7 @@
             <w:r>
               <w:rPr>
                 <w:b/>
-                <w:sz w:val="17"/>
+                <w:sz w:val="20"/>
               </w:rPr>
               <w:t xml:space="preserve">Enters MONTIMI-GO / SPIRANCA-GO through</w:t>
             </w:r>
@@ -4644,7 +4644,7 @@
             <w:r>
               <w:rPr>
                 <w:b/>
-                <w:sz w:val="17"/>
+                <w:sz w:val="20"/>
               </w:rPr>
               <w:t xml:space="preserve">What it does to the decision</w:t>
             </w:r>
@@ -4663,7 +4663,7 @@
             <w:r>
               <w:rPr>
                 <w:b/>
-                <w:sz w:val="17"/>
+                <w:sz w:val="20"/>
               </w:rPr>
               <w:t xml:space="preserve">Papers</w:t>
             </w:r>
@@ -4682,7 +4682,7 @@
             </w:pPr>
             <w:r>
               <w:rPr>
-                <w:sz w:val="17"/>
+                <w:sz w:val="20"/>
               </w:rPr>
               <w:t xml:space="preserve">Ordinary weather</w:t>
             </w:r>
@@ -4699,13 +4699,13 @@
             </w:pPr>
             <w:r>
               <w:rPr>
-                <w:sz w:val="17"/>
+                <w:sz w:val="20"/>
               </w:rPr>
               <w:t xml:space="preserve">inland inflow scaled by recharge; rainfall anchor</w:t>
             </w:r>
             <w:r>
               <w:rPr>
-                <w:sz w:val="17"/>
+                <w:sz w:val="20"/>
               </w:rPr>
               <w:t xml:space="preserve"> </w:t>
             </w:r>
@@ -4716,13 +4716,13 @@
             </m:oMath>
             <w:r>
               <w:rPr>
-                <w:sz w:val="17"/>
+                <w:sz w:val="20"/>
               </w:rPr>
               <w:t xml:space="preserve"> </w:t>
             </w:r>
             <w:r>
               <w:rPr>
-                <w:sz w:val="17"/>
+                <w:sz w:val="20"/>
               </w:rPr>
               <w:t xml:space="preserve">(persistence 0.7)</w:t>
             </w:r>
@@ -4739,7 +4739,7 @@
             </w:pPr>
             <w:r>
               <w:rPr>
-                <w:sz w:val="17"/>
+                <w:sz w:val="20"/>
               </w:rPr>
               <w:t xml:space="preserve">the static certificate holds; forecasts of a few seasons are enough</w:t>
             </w:r>
@@ -4756,7 +4756,7 @@
             </w:pPr>
             <w:r>
               <w:rPr>
-                <w:sz w:val="17"/>
+                <w:sz w:val="20"/>
               </w:rPr>
               <w:t xml:space="preserve">6, 16</w:t>
             </w:r>
@@ -4775,7 +4775,7 @@
             </w:pPr>
             <w:r>
               <w:rPr>
-                <w:sz w:val="17"/>
+                <w:sz w:val="20"/>
               </w:rPr>
               <w:t xml:space="preserve">Intense rainfall</w:t>
             </w:r>
@@ -4792,13 +4792,13 @@
             </w:pPr>
             <w:r>
               <w:rPr>
-                <w:sz w:val="17"/>
+                <w:sz w:val="20"/>
               </w:rPr>
               <w:t xml:space="preserve">the gauge records much more than infiltrates:</w:t>
             </w:r>
             <w:r>
               <w:rPr>
-                <w:sz w:val="17"/>
+                <w:sz w:val="20"/>
               </w:rPr>
               <w:t xml:space="preserve"> </w:t>
             </w:r>
@@ -4889,7 +4889,7 @@
             </w:pPr>
             <w:r>
               <w:rPr>
-                <w:sz w:val="17"/>
+                <w:sz w:val="20"/>
               </w:rPr>
               <w:t xml:space="preserve">the alarm reads the gauge and predicts a freshening that does not come; the anchor itself breaks</w:t>
             </w:r>
@@ -4906,7 +4906,7 @@
             </w:pPr>
             <w:r>
               <w:rPr>
-                <w:sz w:val="17"/>
+                <w:sz w:val="20"/>
               </w:rPr>
               <w:t xml:space="preserve">1, 8, 14, 15, 17</w:t>
             </w:r>
@@ -4925,7 +4925,7 @@
             </w:pPr>
             <w:r>
               <w:rPr>
-                <w:sz w:val="17"/>
+                <w:sz w:val="20"/>
               </w:rPr>
               <w:t xml:space="preserve">Drought</w:t>
             </w:r>
@@ -4942,7 +4942,7 @@
             </w:pPr>
             <w:r>
               <w:rPr>
-                <w:sz w:val="17"/>
+                <w:sz w:val="20"/>
               </w:rPr>
               <w:t xml:space="preserve">inland inflow falls for years, beyond any season of the record</w:t>
             </w:r>
@@ -4959,7 +4959,7 @@
             </w:pPr>
             <w:r>
               <w:rPr>
-                <w:sz w:val="17"/>
+                <w:sz w:val="20"/>
               </w:rPr>
               <w:t xml:space="preserve">extrapolation beyond the record; drift speeds up</w:t>
             </w:r>
@@ -4976,7 +4976,7 @@
             </w:pPr>
             <w:r>
               <w:rPr>
-                <w:sz w:val="17"/>
+                <w:sz w:val="20"/>
               </w:rPr>
               <w:t xml:space="preserve">2, 3, 4, 9, 18</w:t>
             </w:r>
@@ -4995,7 +4995,7 @@
             </w:pPr>
             <w:r>
               <w:rPr>
-                <w:sz w:val="17"/>
+                <w:sz w:val="20"/>
               </w:rPr>
               <w:t xml:space="preserve">Causal change</w:t>
             </w:r>
@@ -5012,7 +5012,7 @@
             </w:pPr>
             <w:r>
               <w:rPr>
-                <w:sz w:val="17"/>
+                <w:sz w:val="20"/>
               </w:rPr>
               <w:t xml:space="preserve">private abstraction responds more strongly than in the record (a changed structural equation, not a shift in span)</w:t>
             </w:r>
@@ -5029,7 +5029,7 @@
             </w:pPr>
             <w:r>
               <w:rPr>
-                <w:sz w:val="17"/>
+                <w:sz w:val="20"/>
               </w:rPr>
               <w:t xml:space="preserve">not covered by the anchor certificate; only measurements catch it</w:t>
             </w:r>
@@ -5046,7 +5046,7 @@
             </w:pPr>
             <w:r>
               <w:rPr>
-                <w:sz w:val="17"/>
+                <w:sz w:val="20"/>
               </w:rPr>
               <w:t xml:space="preserve">5, 9, 13, 19, 20</w:t>
             </w:r>
@@ -5065,7 +5065,7 @@
             </w:pPr>
             <w:r>
               <w:rPr>
-                <w:sz w:val="17"/>
+                <w:sz w:val="20"/>
               </w:rPr>
               <w:t xml:space="preserve">Sea boundary</w:t>
             </w:r>
@@ -5082,7 +5082,7 @@
             </w:pPr>
             <w:r>
               <w:rPr>
-                <w:sz w:val="17"/>
+                <w:sz w:val="20"/>
               </w:rPr>
               <w:t xml:space="preserve">sea level and surge at the sea face</w:t>
             </w:r>
@@ -5099,7 +5099,7 @@
             </w:pPr>
             <w:r>
               <w:rPr>
-                <w:sz w:val="17"/>
+                <w:sz w:val="20"/>
               </w:rPr>
               <w:t xml:space="preserve">slow, attributable trend plus short surges</w:t>
             </w:r>
@@ -5116,7 +5116,7 @@
             </w:pPr>
             <w:r>
               <w:rPr>
-                <w:sz w:val="17"/>
+                <w:sz w:val="20"/>
               </w:rPr>
               <w:t xml:space="preserve">4, 10</w:t>
             </w:r>
@@ -5135,7 +5135,7 @@
             </w:pPr>
             <w:r>
               <w:rPr>
-                <w:sz w:val="17"/>
+                <w:sz w:val="20"/>
               </w:rPr>
               <w:t xml:space="preserve">Decision rules</w:t>
             </w:r>
@@ -5152,7 +5152,7 @@
             </w:pPr>
             <w:r>
               <w:rPr>
-                <w:sz w:val="17"/>
+                <w:sz w:val="20"/>
               </w:rPr>
               <w:t xml:space="preserve">when to cut pumping, how many samples, where to site</w:t>
             </w:r>
@@ -5169,7 +5169,7 @@
             </w:pPr>
             <w:r>
               <w:rPr>
-                <w:sz w:val="17"/>
+                <w:sz w:val="20"/>
               </w:rPr>
               <w:t xml:space="preserve">budgets, risk thresholds, regret, prescriptions</w:t>
             </w:r>
@@ -5186,7 +5186,7 @@
             </w:pPr>
             <w:r>
               <w:rPr>
-                <w:sz w:val="17"/>
+                <w:sz w:val="20"/>
               </w:rPr>
               <w:t xml:space="preserve">6, 7, 11, 12, 16</w:t>
             </w:r>
@@ -6373,7 +6373,7 @@
             <w:r>
               <w:rPr>
                 <w:b/>
-                <w:sz w:val="16"/>
+                <w:sz w:val="19"/>
               </w:rPr>
               <w:t xml:space="preserve">Storyline</w:t>
             </w:r>
@@ -6391,7 +6391,7 @@
             <w:r>
               <w:rPr>
                 <w:b/>
-                <w:sz w:val="16"/>
+                <w:sz w:val="19"/>
               </w:rPr>
               <w:t xml:space="preserve">No action</w:t>
             </w:r>
@@ -6409,7 +6409,7 @@
             <w:r>
               <w:rPr>
                 <w:b/>
-                <w:sz w:val="16"/>
+                <w:sz w:val="19"/>
               </w:rPr>
               <w:t xml:space="preserve">Static alarm</w:t>
             </w:r>
@@ -6427,7 +6427,7 @@
             <w:r>
               <w:rPr>
                 <w:b/>
-                <w:sz w:val="16"/>
+                <w:sz w:val="19"/>
               </w:rPr>
               <w:t xml:space="preserve">Yearly sample (S5)</w:t>
             </w:r>
@@ -6445,7 +6445,7 @@
             <w:r>
               <w:rPr>
                 <w:b/>
-                <w:sz w:val="16"/>
+                <w:sz w:val="19"/>
               </w:rPr>
               <w:t xml:space="preserve">ROJA-GO</w:t>
             </w:r>
@@ -6463,7 +6463,7 @@
             <w:r>
               <w:rPr>
                 <w:b/>
-                <w:sz w:val="16"/>
+                <w:sz w:val="19"/>
               </w:rPr>
               <w:t xml:space="preserve">Screen sensor</w:t>
             </w:r>
@@ -6480,7 +6480,7 @@
             </w:pPr>
             <w:r>
               <w:rPr>
-                <w:sz w:val="16"/>
+                <w:sz w:val="19"/>
               </w:rPr>
               <w:t xml:space="preserve">Ordinary weather</w:t>
             </w:r>
@@ -6495,7 +6495,7 @@
             </w:pPr>
             <w:r>
               <w:rPr>
-                <w:sz w:val="16"/>
+                <w:sz w:val="19"/>
               </w:rPr>
               <w:t xml:space="preserve">25.4%</w:t>
             </w:r>
@@ -6510,7 +6510,7 @@
             </w:pPr>
             <w:r>
               <w:rPr>
-                <w:sz w:val="16"/>
+                <w:sz w:val="19"/>
               </w:rPr>
               <w:t xml:space="preserve">6.1% (84%)</w:t>
             </w:r>
@@ -6525,7 +6525,7 @@
             </w:pPr>
             <w:r>
               <w:rPr>
-                <w:sz w:val="16"/>
+                <w:sz w:val="19"/>
               </w:rPr>
               <w:t xml:space="preserve">0.5% (81%)</w:t>
             </w:r>
@@ -6540,7 +6540,7 @@
             </w:pPr>
             <w:r>
               <w:rPr>
-                <w:sz w:val="16"/>
+                <w:sz w:val="19"/>
               </w:rPr>
               <w:t xml:space="preserve">0.2% (80%)</w:t>
             </w:r>
@@ -6555,7 +6555,7 @@
             </w:pPr>
             <w:r>
               <w:rPr>
-                <w:sz w:val="16"/>
+                <w:sz w:val="19"/>
               </w:rPr>
               <w:t xml:space="preserve">6.3% (94%)</w:t>
             </w:r>
@@ -6572,7 +6572,7 @@
             </w:pPr>
             <w:r>
               <w:rPr>
-                <w:sz w:val="16"/>
+                <w:sz w:val="19"/>
               </w:rPr>
               <w:t xml:space="preserve">Intense rainfall (gauge +2.5 sd for 2 years, a fifth infiltrates)</w:t>
             </w:r>
@@ -6587,7 +6587,7 @@
             </w:pPr>
             <w:r>
               <w:rPr>
-                <w:sz w:val="16"/>
+                <w:sz w:val="19"/>
               </w:rPr>
               <w:t xml:space="preserve">23.8%</w:t>
             </w:r>
@@ -6602,7 +6602,7 @@
             </w:pPr>
             <w:r>
               <w:rPr>
-                <w:sz w:val="16"/>
+                <w:sz w:val="19"/>
               </w:rPr>
               <w:t xml:space="preserve">4.6% (83%)</w:t>
             </w:r>
@@ -6617,7 +6617,7 @@
             </w:pPr>
             <w:r>
               <w:rPr>
-                <w:sz w:val="16"/>
+                <w:sz w:val="19"/>
               </w:rPr>
               <w:t xml:space="preserve">0.3% (81%)</w:t>
             </w:r>
@@ -6632,7 +6632,7 @@
             </w:pPr>
             <w:r>
               <w:rPr>
-                <w:sz w:val="16"/>
+                <w:sz w:val="19"/>
               </w:rPr>
               <w:t xml:space="preserve">0.2% (81%)</w:t>
             </w:r>
@@ -6647,7 +6647,7 @@
             </w:pPr>
             <w:r>
               <w:rPr>
-                <w:sz w:val="16"/>
+                <w:sz w:val="19"/>
               </w:rPr>
               <w:t xml:space="preserve">5.9% (95%)</w:t>
             </w:r>
@@ -6664,7 +6664,7 @@
             </w:pPr>
             <w:r>
               <w:rPr>
-                <w:sz w:val="16"/>
+                <w:sz w:val="19"/>
               </w:rPr>
               <w:t xml:space="preserve">Record-shattering drought (−2 sd for 6 years)</w:t>
             </w:r>
@@ -6679,7 +6679,7 @@
             </w:pPr>
             <w:r>
               <w:rPr>
-                <w:sz w:val="16"/>
+                <w:sz w:val="19"/>
               </w:rPr>
               <w:t xml:space="preserve">52.1%</w:t>
             </w:r>
@@ -6694,7 +6694,7 @@
             </w:pPr>
             <w:r>
               <w:rPr>
-                <w:sz w:val="16"/>
+                <w:sz w:val="19"/>
               </w:rPr>
               <w:t xml:space="preserve">15.0% (78%)</w:t>
             </w:r>
@@ -6709,7 +6709,7 @@
             </w:pPr>
             <w:r>
               <w:rPr>
-                <w:sz w:val="16"/>
+                <w:sz w:val="19"/>
               </w:rPr>
               <w:t xml:space="preserve">5.9% (74%)</w:t>
             </w:r>
@@ -6724,7 +6724,7 @@
             </w:pPr>
             <w:r>
               <w:rPr>
-                <w:sz w:val="16"/>
+                <w:sz w:val="19"/>
               </w:rPr>
               <w:t xml:space="preserve">4.7% (73%)</w:t>
             </w:r>
@@ -6739,7 +6739,7 @@
             </w:pPr>
             <w:r>
               <w:rPr>
-                <w:sz w:val="16"/>
+                <w:sz w:val="19"/>
               </w:rPr>
               <w:t xml:space="preserve">18.0% (87%)</w:t>
             </w:r>
@@ -6756,7 +6756,7 @@
             </w:pPr>
             <w:r>
               <w:rPr>
-                <w:sz w:val="16"/>
+                <w:sz w:val="19"/>
               </w:rPr>
               <w:t xml:space="preserve">Same drought, farmers respond 3× more strongly (causal change)</w:t>
             </w:r>
@@ -6771,7 +6771,7 @@
             </w:pPr>
             <w:r>
               <w:rPr>
-                <w:sz w:val="16"/>
+                <w:sz w:val="19"/>
               </w:rPr>
               <w:t xml:space="preserve">59.3%</w:t>
             </w:r>
@@ -6786,7 +6786,7 @@
             </w:pPr>
             <w:r>
               <w:rPr>
-                <w:sz w:val="16"/>
+                <w:sz w:val="19"/>
               </w:rPr>
               <w:t xml:space="preserve">21.2% (76%)</w:t>
             </w:r>
@@ -6801,7 +6801,7 @@
             </w:pPr>
             <w:r>
               <w:rPr>
-                <w:sz w:val="16"/>
+                <w:sz w:val="19"/>
               </w:rPr>
               <w:t xml:space="preserve">11.5% (72%)</w:t>
             </w:r>
@@ -6816,7 +6816,7 @@
             </w:pPr>
             <w:r>
               <w:rPr>
-                <w:sz w:val="16"/>
+                <w:sz w:val="19"/>
               </w:rPr>
               <w:t xml:space="preserve">9.1% (71%)</w:t>
             </w:r>
@@ -6831,7 +6831,7 @@
             </w:pPr>
             <w:r>
               <w:rPr>
-                <w:sz w:val="16"/>
+                <w:sz w:val="19"/>
               </w:rPr>
               <w:t xml:space="preserve">24.5% (84%)</w:t>
             </w:r>
@@ -6848,7 +6848,7 @@
             </w:pPr>
             <w:r>
               <w:rPr>
-                <w:sz w:val="16"/>
+                <w:sz w:val="19"/>
               </w:rPr>
               <w:t xml:space="preserve">Drought, then 2 years of intense rain on dry ground</w:t>
             </w:r>
@@ -6863,7 +6863,7 @@
             </w:pPr>
             <w:r>
               <w:rPr>
-                <w:sz w:val="16"/>
+                <w:sz w:val="19"/>
               </w:rPr>
               <w:t xml:space="preserve">49.8%</w:t>
             </w:r>
@@ -6878,7 +6878,7 @@
             </w:pPr>
             <w:r>
               <w:rPr>
-                <w:sz w:val="16"/>
+                <w:sz w:val="19"/>
               </w:rPr>
               <w:t xml:space="preserve">13.1% (77%)</w:t>
             </w:r>
@@ -6893,7 +6893,7 @@
             </w:pPr>
             <w:r>
               <w:rPr>
-                <w:sz w:val="16"/>
+                <w:sz w:val="19"/>
               </w:rPr>
               <w:t xml:space="preserve">5.1% (75%)</w:t>
             </w:r>
@@ -6908,7 +6908,7 @@
             </w:pPr>
             <w:r>
               <w:rPr>
-                <w:sz w:val="16"/>
+                <w:sz w:val="19"/>
               </w:rPr>
               <w:t xml:space="preserve">4.3% (74%)</w:t>
             </w:r>
@@ -6923,7 +6923,7 @@
             </w:pPr>
             <w:r>
               <w:rPr>
-                <w:sz w:val="16"/>
+                <w:sz w:val="19"/>
               </w:rPr>
               <w:t xml:space="preserve">17.2% (88%)</w:t>
             </w:r>
@@ -6938,7 +6938,7 @@
       <w:r>
         <w:drawing>
           <wp:inline>
-            <wp:extent cx="5334000" cy="1921216"/>
+            <wp:extent cx="9360000" cy="3612335"/>
             <wp:effectExtent b="0" l="0" r="0" t="0"/>
             <wp:docPr descr="Figure 1. (a) Share of seasons above 250 mg/L at the supply screen with the rule “cut pumping after an alarm” (dot: mean over 20 aquifers; line: 10–90% range). (b) One aquifer in the record drought, open loop: chloride at the screen, the yearly re-anchored prediction and the ROJA-GO prediction; ticks: seasons when the watch fires and an extra sample is taken." title="" id="28" name="Picture"/>
             <a:graphic>
@@ -6959,7 +6959,7 @@
                   <pic:spPr bwMode="auto">
                     <a:xfrm>
                       <a:off x="0" y="0"/>
-                      <a:ext cx="5334000" cy="1921216"/>
+                      <a:ext cx="9360000" cy="3612335"/>
                     </a:xfrm>
                     <a:prstGeom prst="rect">
                       <a:avLst/>
@@ -7052,7 +7052,7 @@
             <w:r>
               <w:rPr>
                 <w:b/>
-                <w:sz w:val="16"/>
+                <w:sz w:val="19"/>
               </w:rPr>
               <w:t xml:space="preserve">Storyline</w:t>
             </w:r>
@@ -7070,7 +7070,7 @@
             <w:r>
               <w:rPr>
                 <w:b/>
-                <w:sz w:val="16"/>
+                <w:sz w:val="19"/>
               </w:rPr>
               <w:t xml:space="preserve">Static</w:t>
             </w:r>
@@ -7088,7 +7088,7 @@
             <w:r>
               <w:rPr>
                 <w:b/>
-                <w:sz w:val="16"/>
+                <w:sz w:val="19"/>
               </w:rPr>
               <w:t xml:space="preserve">Yearly sample</w:t>
             </w:r>
@@ -7106,7 +7106,7 @@
             <w:r>
               <w:rPr>
                 <w:b/>
-                <w:sz w:val="16"/>
+                <w:sz w:val="19"/>
               </w:rPr>
               <w:t xml:space="preserve">Extra samples only</w:t>
             </w:r>
@@ -7124,7 +7124,7 @@
             <w:r>
               <w:rPr>
                 <w:b/>
-                <w:sz w:val="16"/>
+                <w:sz w:val="19"/>
               </w:rPr>
               <w:t xml:space="preserve">Adaptive window only</w:t>
             </w:r>
@@ -7142,7 +7142,7 @@
             <w:r>
               <w:rPr>
                 <w:b/>
-                <w:sz w:val="16"/>
+                <w:sz w:val="19"/>
               </w:rPr>
               <w:t xml:space="preserve">ROJA-GO</w:t>
             </w:r>
@@ -7160,7 +7160,7 @@
             <w:r>
               <w:rPr>
                 <w:b/>
-                <w:sz w:val="16"/>
+                <w:sz w:val="19"/>
               </w:rPr>
               <w:t xml:space="preserve">Least squares + ROJA</w:t>
             </w:r>
@@ -7177,7 +7177,7 @@
             </w:pPr>
             <w:r>
               <w:rPr>
-                <w:sz w:val="16"/>
+                <w:sz w:val="19"/>
               </w:rPr>
               <w:t xml:space="preserve">Ordinary weather</w:t>
             </w:r>
@@ -7192,7 +7192,7 @@
             </w:pPr>
             <w:r>
               <w:rPr>
-                <w:sz w:val="16"/>
+                <w:sz w:val="19"/>
               </w:rPr>
               <w:t xml:space="preserve">26.1% (10)</w:t>
             </w:r>
@@ -7207,7 +7207,7 @@
             </w:pPr>
             <w:r>
               <w:rPr>
-                <w:sz w:val="16"/>
+                <w:sz w:val="19"/>
               </w:rPr>
               <w:t xml:space="preserve">3.5% (2)</w:t>
             </w:r>
@@ -7222,7 +7222,7 @@
             </w:pPr>
             <w:r>
               <w:rPr>
-                <w:sz w:val="16"/>
+                <w:sz w:val="19"/>
               </w:rPr>
               <w:t xml:space="preserve">3.3% (2)</w:t>
             </w:r>
@@ -7237,7 +7237,7 @@
             </w:pPr>
             <w:r>
               <w:rPr>
-                <w:sz w:val="16"/>
+                <w:sz w:val="19"/>
               </w:rPr>
               <w:t xml:space="preserve">3.0% (2)</w:t>
             </w:r>
@@ -7252,7 +7252,7 @@
             </w:pPr>
             <w:r>
               <w:rPr>
-                <w:sz w:val="16"/>
+                <w:sz w:val="19"/>
               </w:rPr>
               <w:t xml:space="preserve">2.7% (1)</w:t>
             </w:r>
@@ -7267,7 +7267,7 @@
             </w:pPr>
             <w:r>
               <w:rPr>
-                <w:sz w:val="16"/>
+                <w:sz w:val="19"/>
               </w:rPr>
               <w:t xml:space="preserve">24.5% (8)</w:t>
             </w:r>
@@ -7284,7 +7284,7 @@
             </w:pPr>
             <w:r>
               <w:rPr>
-                <w:sz w:val="16"/>
+                <w:sz w:val="19"/>
               </w:rPr>
               <w:t xml:space="preserve">Intense rainfall (gauge +2.5 sd for 2 years, a fifth infiltrates)</w:t>
             </w:r>
@@ -7299,7 +7299,7 @@
             </w:pPr>
             <w:r>
               <w:rPr>
-                <w:sz w:val="16"/>
+                <w:sz w:val="19"/>
               </w:rPr>
               <w:t xml:space="preserve">23.7% (7)</w:t>
             </w:r>
@@ -7314,7 +7314,7 @@
             </w:pPr>
             <w:r>
               <w:rPr>
-                <w:sz w:val="16"/>
+                <w:sz w:val="19"/>
               </w:rPr>
               <w:t xml:space="preserve">4.7% (3)</w:t>
             </w:r>
@@ -7329,7 +7329,7 @@
             </w:pPr>
             <w:r>
               <w:rPr>
-                <w:sz w:val="16"/>
+                <w:sz w:val="19"/>
               </w:rPr>
               <w:t xml:space="preserve">4.5% (3)</w:t>
             </w:r>
@@ -7344,7 +7344,7 @@
             </w:pPr>
             <w:r>
               <w:rPr>
-                <w:sz w:val="16"/>
+                <w:sz w:val="19"/>
               </w:rPr>
               <w:t xml:space="preserve">4.2% (2)</w:t>
             </w:r>
@@ -7359,7 +7359,7 @@
             </w:pPr>
             <w:r>
               <w:rPr>
-                <w:sz w:val="16"/>
+                <w:sz w:val="19"/>
               </w:rPr>
               <w:t xml:space="preserve">3.3% (3)</w:t>
             </w:r>
@@ -7374,7 +7374,7 @@
             </w:pPr>
             <w:r>
               <w:rPr>
-                <w:sz w:val="16"/>
+                <w:sz w:val="19"/>
               </w:rPr>
               <w:t xml:space="preserve">28.0% (8)</w:t>
             </w:r>
@@ -7391,7 +7391,7 @@
             </w:pPr>
             <w:r>
               <w:rPr>
-                <w:sz w:val="16"/>
+                <w:sz w:val="19"/>
               </w:rPr>
               <w:t xml:space="preserve">Record-shattering drought (−2 sd for 6 years)</w:t>
             </w:r>
@@ -7406,7 +7406,7 @@
             </w:pPr>
             <w:r>
               <w:rPr>
-                <w:sz w:val="16"/>
+                <w:sz w:val="19"/>
               </w:rPr>
               <w:t xml:space="preserve">26.7% (12)</w:t>
             </w:r>
@@ -7421,7 +7421,7 @@
             </w:pPr>
             <w:r>
               <w:rPr>
-                <w:sz w:val="16"/>
+                <w:sz w:val="19"/>
               </w:rPr>
               <w:t xml:space="preserve">6.9% (3)</w:t>
             </w:r>
@@ -7436,7 +7436,7 @@
             </w:pPr>
             <w:r>
               <w:rPr>
-                <w:sz w:val="16"/>
+                <w:sz w:val="19"/>
               </w:rPr>
               <w:t xml:space="preserve">5.0% (1)</w:t>
             </w:r>
@@ -7451,7 +7451,7 @@
             </w:pPr>
             <w:r>
               <w:rPr>
-                <w:sz w:val="16"/>
+                <w:sz w:val="19"/>
               </w:rPr>
               <w:t xml:space="preserve">5.4% (2)</w:t>
             </w:r>
@@ -7466,7 +7466,7 @@
             </w:pPr>
             <w:r>
               <w:rPr>
-                <w:sz w:val="16"/>
+                <w:sz w:val="19"/>
               </w:rPr>
               <w:t xml:space="preserve">3.8% (1)</w:t>
             </w:r>
@@ -7481,7 +7481,7 @@
             </w:pPr>
             <w:r>
               <w:rPr>
-                <w:sz w:val="16"/>
+                <w:sz w:val="19"/>
               </w:rPr>
               <w:t xml:space="preserve">23.1% (8)</w:t>
             </w:r>
@@ -7498,7 +7498,7 @@
             </w:pPr>
             <w:r>
               <w:rPr>
-                <w:sz w:val="16"/>
+                <w:sz w:val="19"/>
               </w:rPr>
               <w:t xml:space="preserve">Same drought, farmers respond 3× more strongly (causal change)</w:t>
             </w:r>
@@ -7513,7 +7513,7 @@
             </w:pPr>
             <w:r>
               <w:rPr>
-                <w:sz w:val="16"/>
+                <w:sz w:val="19"/>
               </w:rPr>
               <w:t xml:space="preserve">21.5% (10)</w:t>
             </w:r>
@@ -7528,7 +7528,7 @@
             </w:pPr>
             <w:r>
               <w:rPr>
-                <w:sz w:val="16"/>
+                <w:sz w:val="19"/>
               </w:rPr>
               <w:t xml:space="preserve">8.3% (6)</w:t>
             </w:r>
@@ -7543,7 +7543,7 @@
             </w:pPr>
             <w:r>
               <w:rPr>
-                <w:sz w:val="16"/>
+                <w:sz w:val="19"/>
               </w:rPr>
               <w:t xml:space="preserve">6.9% (4)</w:t>
             </w:r>
@@ -7558,7 +7558,7 @@
             </w:pPr>
             <w:r>
               <w:rPr>
-                <w:sz w:val="16"/>
+                <w:sz w:val="19"/>
               </w:rPr>
               <w:t xml:space="preserve">6.7% (3)</w:t>
             </w:r>
@@ -7573,7 +7573,7 @@
             </w:pPr>
             <w:r>
               <w:rPr>
-                <w:sz w:val="16"/>
+                <w:sz w:val="19"/>
               </w:rPr>
               <w:t xml:space="preserve">4.3% (2)</w:t>
             </w:r>
@@ -7588,7 +7588,7 @@
             </w:pPr>
             <w:r>
               <w:rPr>
-                <w:sz w:val="16"/>
+                <w:sz w:val="19"/>
               </w:rPr>
               <w:t xml:space="preserve">24.5% (9)</w:t>
             </w:r>
@@ -7605,7 +7605,7 @@
             </w:pPr>
             <w:r>
               <w:rPr>
-                <w:sz w:val="16"/>
+                <w:sz w:val="19"/>
               </w:rPr>
               <w:t xml:space="preserve">Drought, then 2 years of intense rain on dry ground</w:t>
             </w:r>
@@ -7620,7 +7620,7 @@
             </w:pPr>
             <w:r>
               <w:rPr>
-                <w:sz w:val="16"/>
+                <w:sz w:val="19"/>
               </w:rPr>
               <w:t xml:space="preserve">23.2% (10)</w:t>
             </w:r>
@@ -7635,7 +7635,7 @@
             </w:pPr>
             <w:r>
               <w:rPr>
-                <w:sz w:val="16"/>
+                <w:sz w:val="19"/>
               </w:rPr>
               <w:t xml:space="preserve">6.2% (3)</w:t>
             </w:r>
@@ -7650,7 +7650,7 @@
             </w:pPr>
             <w:r>
               <w:rPr>
-                <w:sz w:val="16"/>
+                <w:sz w:val="19"/>
               </w:rPr>
               <w:t xml:space="preserve">5.0% (2)</w:t>
             </w:r>
@@ -7665,7 +7665,7 @@
             </w:pPr>
             <w:r>
               <w:rPr>
-                <w:sz w:val="16"/>
+                <w:sz w:val="19"/>
               </w:rPr>
               <w:t xml:space="preserve">4.8% (2)</w:t>
             </w:r>
@@ -7680,7 +7680,7 @@
             </w:pPr>
             <w:r>
               <w:rPr>
-                <w:sz w:val="16"/>
+                <w:sz w:val="19"/>
               </w:rPr>
               <w:t xml:space="preserve">3.7% (1)</w:t>
             </w:r>
@@ -7695,7 +7695,7 @@
             </w:pPr>
             <w:r>
               <w:rPr>
-                <w:sz w:val="16"/>
+                <w:sz w:val="19"/>
               </w:rPr>
               <w:t xml:space="preserve">24.9% (9)</w:t>
             </w:r>
@@ -7712,7 +7712,7 @@
             </w:pPr>
             <w:r>
               <w:rPr>
-                <w:sz w:val="16"/>
+                <w:sz w:val="19"/>
               </w:rPr>
               <w:t xml:space="preserve">Samples in 30 years</w:t>
             </w:r>
@@ -7727,7 +7727,7 @@
             </w:pPr>
             <w:r>
               <w:rPr>
-                <w:sz w:val="16"/>
+                <w:sz w:val="19"/>
               </w:rPr>
               <w:t xml:space="preserve">0</w:t>
             </w:r>
@@ -7742,7 +7742,7 @@
             </w:pPr>
             <w:r>
               <w:rPr>
-                <w:sz w:val="16"/>
+                <w:sz w:val="19"/>
               </w:rPr>
               <w:t xml:space="preserve">30</w:t>
             </w:r>
@@ -7757,7 +7757,7 @@
             </w:pPr>
             <w:r>
               <w:rPr>
-                <w:sz w:val="16"/>
+                <w:sz w:val="19"/>
               </w:rPr>
               <w:t xml:space="preserve">36</w:t>
             </w:r>
@@ -7772,7 +7772,7 @@
             </w:pPr>
             <w:r>
               <w:rPr>
-                <w:sz w:val="16"/>
+                <w:sz w:val="19"/>
               </w:rPr>
               <w:t xml:space="preserve">30</w:t>
             </w:r>
@@ -7787,7 +7787,7 @@
             </w:pPr>
             <w:r>
               <w:rPr>
-                <w:sz w:val="16"/>
+                <w:sz w:val="19"/>
               </w:rPr>
               <w:t xml:space="preserve">36</w:t>
             </w:r>
@@ -7802,7 +7802,7 @@
             </w:pPr>
             <w:r>
               <w:rPr>
-                <w:sz w:val="16"/>
+                <w:sz w:val="19"/>
               </w:rPr>
               <w:t xml:space="preserve">36</w:t>
             </w:r>
@@ -8169,7 +8169,7 @@
     <w:qFormat/>
     <w:rPr>
       <w:rFonts w:ascii="Calibri" w:hAnsi="Calibri"/>
-      <w:sz w:val="20"/>
+      <w:sz w:val="24"/>
     </w:rPr>
   </w:style>
   <w:style w:styleId="BodyText" w:type="paragraph">
@@ -8182,7 +8182,7 @@
     <w:qFormat/>
     <w:rPr>
       <w:rFonts w:ascii="Calibri" w:hAnsi="Calibri"/>
-      <w:sz w:val="20"/>
+      <w:sz w:val="24"/>
     </w:rPr>
   </w:style>
   <w:style w:customStyle="1" w:styleId="FirstParagraph" w:type="paragraph">
@@ -8192,7 +8192,7 @@
     <w:qFormat/>
     <w:rPr>
       <w:rFonts w:ascii="Calibri" w:hAnsi="Calibri"/>
-      <w:sz w:val="20"/>
+      <w:sz w:val="24"/>
     </w:rPr>
   </w:style>
   <w:style w:customStyle="1" w:styleId="Compact" w:type="paragraph">
@@ -8204,7 +8204,7 @@
     </w:pPr>
     <w:rPr>
       <w:rFonts w:ascii="Calibri" w:hAnsi="Calibri"/>
-      <w:sz w:val="16"/>
+      <w:sz w:val="19"/>
     </w:rPr>
   </w:style>
   <w:style w:styleId="Title" w:type="paragraph">
@@ -8223,7 +8223,7 @@
       <w:b/>
       <w:bCs/>
       <w:color w:val="1F3864"/>
-      <w:sz w:val="40"/>
+      <w:sz w:val="44"/>
       <w:szCs w:val="36"/>
     </w:rPr>
   </w:style>
@@ -8241,7 +8241,7 @@
     <w:rPr>
       <w:rFonts w:ascii="Calibri" w:hAnsi="Calibri"/>
       <w:color w:val="2E5597"/>
-      <w:sz w:val="24"/>
+      <w:sz w:val="26"/>
       <w:szCs w:val="30"/>
     </w:rPr>
   </w:style>
@@ -8346,7 +8346,7 @@
       <w:b/>
       <w:bCs/>
       <w:color w:val="1F3864"/>
-      <w:sz w:val="28"/>
+      <w:sz w:val="32"/>
       <w:szCs w:val="28"/>
     </w:rPr>
   </w:style>
@@ -8368,7 +8368,7 @@
       <w:b/>
       <w:bCs/>
       <w:color w:val="2E5597"/>
-      <w:sz w:val="24"/>
+      <w:sz w:val="27"/>
       <w:szCs w:val="24"/>
     </w:rPr>
   </w:style>
@@ -8589,6 +8589,10 @@
   <w:style w:customStyle="1" w:styleId="ImageCaption" w:type="paragraph">
     <w:name w:val="Image Caption"/>
     <w:basedOn w:val="Caption"/>
+    <w:rPr>
+      <w:rFonts w:ascii="Calibri" w:hAnsi="Calibri"/>
+      <w:sz w:val="21"/>
+    </w:rPr>
   </w:style>
   <w:style w:customStyle="1" w:styleId="Figure" w:type="paragraph">
     <w:name w:val="Figure"/>

</xml_diff>